<commit_message>
Match reference invoice styling; simplify UI
- Rebuild template as greyscale: header rule, info cards, status badges,
  horizontal-rule-only products table, no footer line
- Reseller card moved left, customer right, per reference
- Strip 'What you get' cards, hero pills and verbose sidebar sections
</commit_message>
<xml_diff>
--- a/template.docx
+++ b/template.docx
@@ -5,7 +5,7 @@
     <w:tbl>
       <w:tblPr>
         <w:tblW w:type="auto" w:w="0"/>
-        <w:tblLayout w:type="autofit"/>
+        <w:tblLayout w:type="fixed"/>
         <w:tblLook w:firstColumn="1" w:firstRow="1" w:lastColumn="0" w:lastRow="0" w:noHBand="0" w:noVBand="1" w:val="04A0"/>
       </w:tblPr>
       <w:tblGrid>
@@ -15,18 +15,24 @@
       <w:tr>
         <w:tc>
           <w:tcPr>
-            <w:tcW w:type="dxa" w:w="5040"/>
+            <w:tcW w:type="dxa" w:w="6048"/>
+            <w:tcBorders>
+              <w:top w:val="nil"/>
+              <w:bottom w:val="nil"/>
+              <w:left w:val="nil"/>
+              <w:right w:val="nil"/>
+            </w:tcBorders>
           </w:tcPr>
           <w:p>
             <w:pPr>
-              <w:spacing w:after="0"/>
+              <w:spacing w:before="0" w:after="0"/>
             </w:pPr>
             <w:r>
               <w:rPr>
                 <w:rFonts w:ascii="Calibri" w:hAnsi="Calibri"/>
                 <w:b/>
-                <w:color w:val="4F46E5"/>
-                <w:sz w:val="38"/>
+                <w:color w:val="111111"/>
+                <w:sz w:val="36"/>
               </w:rPr>
               <w:t>{{ company_name }}</w:t>
             </w:r>
@@ -34,49 +40,78 @@
         </w:tc>
         <w:tc>
           <w:tcPr>
-            <w:tcW w:type="dxa" w:w="5040"/>
+            <w:tcW w:type="dxa" w:w="4032"/>
+            <w:tcBorders>
+              <w:top w:val="nil"/>
+              <w:bottom w:val="nil"/>
+              <w:left w:val="nil"/>
+              <w:right w:val="nil"/>
+            </w:tcBorders>
           </w:tcPr>
           <w:p>
             <w:pPr>
-              <w:spacing w:after="0"/>
+              <w:spacing w:before="0" w:after="0"/>
               <w:jc w:val="right"/>
             </w:pPr>
             <w:r>
               <w:rPr>
                 <w:rFonts w:ascii="Calibri" w:hAnsi="Calibri"/>
                 <w:b/>
-                <w:caps/>
-                <w:color w:val="1F2328"/>
-                <w:sz w:val="38"/>
+                <w:color w:val="111111"/>
+                <w:sz w:val="36"/>
               </w:rPr>
-              <w:t>INVOICE</w:t>
+              <w:t>{{ invoice_number }}</w:t>
             </w:r>
           </w:p>
+        </w:tc>
+      </w:tr>
+      <w:tr>
+        <w:tc>
+          <w:tcPr>
+            <w:tcW w:type="dxa" w:w="6048"/>
+            <w:tcBorders>
+              <w:top w:val="nil"/>
+              <w:bottom w:val="single" w:sz="4" w:space="0" w:color="D4D4D4"/>
+              <w:left w:val="nil"/>
+              <w:right w:val="nil"/>
+            </w:tcBorders>
+          </w:tcPr>
           <w:p>
             <w:pPr>
-              <w:spacing w:before="40"/>
-              <w:jc w:val="right"/>
+              <w:spacing w:before="0" w:after="0"/>
             </w:pPr>
             <w:r>
               <w:rPr>
                 <w:rFonts w:ascii="Calibri" w:hAnsi="Calibri"/>
-                <w:b/>
-                <w:color w:val="6B7280"/>
-                <w:sz w:val="21"/>
+                <w:b w:val="0"/>
+                <w:color w:val="707070"/>
+                <w:sz w:val="18"/>
               </w:rPr>
-              <w:t>{{ invoice_number }}</w:t>
+              <w:t>Invoice</w:t>
             </w:r>
           </w:p>
+        </w:tc>
+        <w:tc>
+          <w:tcPr>
+            <w:tcW w:type="dxa" w:w="4032"/>
+            <w:tcBorders>
+              <w:top w:val="nil"/>
+              <w:bottom w:val="single" w:sz="4" w:space="0" w:color="D4D4D4"/>
+              <w:left w:val="nil"/>
+              <w:right w:val="nil"/>
+            </w:tcBorders>
+          </w:tcPr>
           <w:p>
             <w:pPr>
+              <w:spacing w:before="0" w:after="0"/>
               <w:jc w:val="right"/>
             </w:pPr>
             <w:r>
               <w:rPr>
                 <w:rFonts w:ascii="Calibri" w:hAnsi="Calibri"/>
                 <w:b w:val="0"/>
-                <w:color w:val="6B7280"/>
-                <w:sz w:val="20"/>
+                <w:color w:val="707070"/>
+                <w:sz w:val="18"/>
               </w:rPr>
               <w:t>{{ invoice_date }}</w:t>
             </w:r>
@@ -84,48 +119,132 @@
         </w:tc>
       </w:tr>
     </w:tbl>
-    <w:p/>
+    <w:p>
+      <w:pPr>
+        <w:spacing w:before="0" w:after="160"/>
+      </w:pPr>
+    </w:p>
     <w:tbl>
       <w:tblPr>
-        <w:tblStyle w:val="TableGrid"/>
         <w:tblW w:type="auto" w:w="0"/>
         <w:jc w:val="center"/>
+        <w:tblLayout w:type="fixed"/>
         <w:tblLook w:firstColumn="1" w:firstRow="1" w:lastColumn="0" w:lastRow="0" w:noHBand="0" w:noVBand="1" w:val="04A0"/>
       </w:tblPr>
       <w:tblGrid>
-        <w:gridCol w:w="5040"/>
-        <w:gridCol w:w="5040"/>
+        <w:gridCol w:w="3360"/>
+        <w:gridCol w:w="3360"/>
+        <w:gridCol w:w="3360"/>
       </w:tblGrid>
       <w:tr>
         <w:tc>
           <w:tcPr>
-            <w:tcW w:type="dxa" w:w="5040"/>
-            <w:shd w:val="clear" w:fill="F7F7FB"/>
+            <w:tcW w:type="dxa" w:w="4824"/>
+            <w:shd w:val="clear" w:fill="F4F4F4"/>
+            <w:tcBorders>
+              <w:top w:val="single" w:sz="4" w:space="0" w:color="D4D4D4"/>
+              <w:bottom w:val="single" w:sz="4" w:space="0" w:color="D4D4D4"/>
+              <w:left w:val="single" w:sz="4" w:space="0" w:color="D4D4D4"/>
+              <w:right w:val="single" w:sz="4" w:space="0" w:color="D4D4D4"/>
+            </w:tcBorders>
+            <w:tcMar>
+              <w:top w:w="130" w:type="dxa"/>
+              <w:bottom w:w="130" w:type="dxa"/>
+              <w:left w:w="143" w:type="dxa"/>
+              <w:right w:w="143" w:type="dxa"/>
+            </w:tcMar>
           </w:tcPr>
           <w:p>
             <w:pPr>
-              <w:spacing w:after="20"/>
+              <w:spacing w:before="0" w:after="60"/>
             </w:pPr>
             <w:r>
               <w:rPr>
                 <w:rFonts w:ascii="Calibri" w:hAnsi="Calibri"/>
                 <w:b/>
-                <w:caps/>
-                <w:color w:val="6B7280"/>
-                <w:sz w:val="15"/>
+                <w:color w:val="111111"/>
+                <w:sz w:val="19"/>
+              </w:rPr>
+              <w:t>Reseller</w:t>
+            </w:r>
+          </w:p>
+          <w:p>
+            <w:pPr>
+              <w:spacing w:before="0" w:after="0"/>
+            </w:pPr>
+            <w:r>
+              <w:rPr>
+                <w:rFonts w:ascii="Calibri" w:hAnsi="Calibri"/>
+                <w:b/>
+                <w:color w:val="111111"/>
+                <w:sz w:val="21"/>
+              </w:rPr>
+              <w:t>{{ reseller_info }}</w:t>
+            </w:r>
+          </w:p>
+          <w:p>
+            <w:pPr>
+              <w:spacing w:before="40" w:after="0"/>
+            </w:pPr>
+          </w:p>
+          <w:p>
+            <w:pPr>
+              <w:spacing w:before="40" w:after="0"/>
+            </w:pPr>
+          </w:p>
+        </w:tc>
+        <w:tc>
+          <w:tcPr>
+            <w:tcW w:type="dxa" w:w="432"/>
+            <w:tcBorders>
+              <w:top w:val="nil"/>
+              <w:bottom w:val="nil"/>
+              <w:left w:val="nil"/>
+              <w:right w:val="nil"/>
+            </w:tcBorders>
+          </w:tcPr>
+          <w:p/>
+        </w:tc>
+        <w:tc>
+          <w:tcPr>
+            <w:tcW w:type="dxa" w:w="4824"/>
+            <w:shd w:val="clear" w:fill="F4F4F4"/>
+            <w:tcBorders>
+              <w:top w:val="single" w:sz="4" w:space="0" w:color="D4D4D4"/>
+              <w:bottom w:val="single" w:sz="4" w:space="0" w:color="D4D4D4"/>
+              <w:left w:val="single" w:sz="4" w:space="0" w:color="D4D4D4"/>
+              <w:right w:val="single" w:sz="4" w:space="0" w:color="D4D4D4"/>
+            </w:tcBorders>
+            <w:tcMar>
+              <w:top w:w="130" w:type="dxa"/>
+              <w:bottom w:w="130" w:type="dxa"/>
+              <w:left w:w="143" w:type="dxa"/>
+              <w:right w:w="143" w:type="dxa"/>
+            </w:tcMar>
+          </w:tcPr>
+          <w:p>
+            <w:pPr>
+              <w:spacing w:before="0" w:after="60"/>
+            </w:pPr>
+            <w:r>
+              <w:rPr>
+                <w:rFonts w:ascii="Calibri" w:hAnsi="Calibri"/>
+                <w:b/>
+                <w:color w:val="111111"/>
+                <w:sz w:val="19"/>
               </w:rPr>
               <w:t>Customer / Receiver</w:t>
             </w:r>
           </w:p>
           <w:p>
             <w:pPr>
-              <w:spacing w:after="0"/>
+              <w:spacing w:before="0" w:after="0"/>
             </w:pPr>
             <w:r>
               <w:rPr>
                 <w:rFonts w:ascii="Calibri" w:hAnsi="Calibri"/>
                 <w:b/>
-                <w:color w:val="1F2328"/>
+                <w:color w:val="111111"/>
                 <w:sz w:val="21"/>
               </w:rPr>
               <w:t>{{ customer_name }}</w:t>
@@ -133,147 +252,232 @@
           </w:p>
           <w:p>
             <w:pPr>
-              <w:spacing w:before="40"/>
+              <w:spacing w:before="40" w:after="0"/>
             </w:pPr>
             <w:r>
               <w:rPr>
                 <w:rFonts w:ascii="Calibri" w:hAnsi="Calibri"/>
                 <w:b w:val="0"/>
-                <w:color w:val="6B7280"/>
-                <w:sz w:val="20"/>
+                <w:color w:val="707070"/>
+                <w:sz w:val="19"/>
               </w:rPr>
               <w:t>{{ customer_address }}</w:t>
             </w:r>
           </w:p>
         </w:tc>
+      </w:tr>
+    </w:tbl>
+    <w:p>
+      <w:pPr>
+        <w:spacing w:before="0" w:after="120"/>
+      </w:pPr>
+    </w:p>
+    <w:tbl>
+      <w:tblPr>
+        <w:tblW w:type="auto" w:w="0"/>
+        <w:jc w:val="center"/>
+        <w:tblLayout w:type="fixed"/>
+        <w:tblLook w:firstColumn="1" w:firstRow="1" w:lastColumn="0" w:lastRow="0" w:noHBand="0" w:noVBand="1" w:val="04A0"/>
+      </w:tblPr>
+      <w:tblGrid>
+        <w:gridCol w:w="3360"/>
+        <w:gridCol w:w="3360"/>
+        <w:gridCol w:w="3360"/>
+      </w:tblGrid>
+      <w:tr>
         <w:tc>
           <w:tcPr>
-            <w:tcW w:type="dxa" w:w="5040"/>
-            <w:shd w:val="clear" w:fill="F7F7FB"/>
+            <w:tcW w:type="dxa" w:w="4824"/>
+            <w:shd w:val="clear" w:fill="F4F4F4"/>
+            <w:tcBorders>
+              <w:top w:val="single" w:sz="4" w:space="0" w:color="D4D4D4"/>
+              <w:bottom w:val="single" w:sz="4" w:space="0" w:color="D4D4D4"/>
+              <w:left w:val="single" w:sz="4" w:space="0" w:color="D4D4D4"/>
+              <w:right w:val="single" w:sz="4" w:space="0" w:color="D4D4D4"/>
+            </w:tcBorders>
+            <w:tcMar>
+              <w:top w:w="130" w:type="dxa"/>
+              <w:bottom w:w="130" w:type="dxa"/>
+              <w:left w:w="143" w:type="dxa"/>
+              <w:right w:w="143" w:type="dxa"/>
+            </w:tcMar>
           </w:tcPr>
           <w:p>
             <w:pPr>
-              <w:spacing w:after="20"/>
+              <w:spacing w:before="0" w:after="60"/>
             </w:pPr>
             <w:r>
               <w:rPr>
                 <w:rFonts w:ascii="Calibri" w:hAnsi="Calibri"/>
                 <w:b/>
-                <w:caps/>
-                <w:color w:val="6B7280"/>
-                <w:sz w:val="15"/>
+                <w:color w:val="111111"/>
+                <w:sz w:val="19"/>
               </w:rPr>
-              <w:t>Reseller</w:t>
+              <w:t>Payment Status</w:t>
             </w:r>
           </w:p>
+          <w:tbl>
+            <w:tblPr>
+              <w:tblW w:type="auto" w:w="0"/>
+              <w:tblLayout w:type="fixed"/>
+              <w:tblLook w:firstColumn="1" w:firstRow="1" w:lastColumn="0" w:lastRow="0" w:noHBand="0" w:noVBand="1" w:val="04A0"/>
+            </w:tblPr>
+            <w:tblGrid>
+              <w:gridCol w:w="4824"/>
+            </w:tblGrid>
+            <w:tr>
+              <w:tc>
+                <w:tcPr>
+                  <w:tcW w:type="dxa" w:w="2232"/>
+                  <w:shd w:val="clear" w:fill="FFFFFF"/>
+                  <w:tcBorders>
+                    <w:top w:val="single" w:sz="4" w:space="0" w:color="BFBFBF"/>
+                    <w:bottom w:val="single" w:sz="4" w:space="0" w:color="BFBFBF"/>
+                    <w:left w:val="single" w:sz="4" w:space="0" w:color="BFBFBF"/>
+                    <w:right w:val="single" w:sz="4" w:space="0" w:color="BFBFBF"/>
+                  </w:tcBorders>
+                  <w:tcMar>
+                    <w:top w:w="70" w:type="dxa"/>
+                    <w:bottom w:w="70" w:type="dxa"/>
+                    <w:left w:w="77" w:type="dxa"/>
+                    <w:right w:w="77" w:type="dxa"/>
+                  </w:tcMar>
+                </w:tcPr>
+                <w:p>
+                  <w:pPr>
+                    <w:spacing w:before="0" w:after="0"/>
+                    <w:jc w:val="center"/>
+                  </w:pPr>
+                  <w:r>
+                    <w:rPr>
+                      <w:rFonts w:ascii="Calibri" w:hAnsi="Calibri"/>
+                      <w:b w:val="0"/>
+                      <w:color w:val="333333"/>
+                      <w:sz w:val="19"/>
+                    </w:rPr>
+                    <w:t>{{ payment_status }}</w:t>
+                  </w:r>
+                </w:p>
+              </w:tc>
+            </w:tr>
+          </w:tbl>
+          <w:p/>
+        </w:tc>
+        <w:tc>
+          <w:tcPr>
+            <w:tcW w:type="dxa" w:w="432"/>
+            <w:tcBorders>
+              <w:top w:val="nil"/>
+              <w:bottom w:val="nil"/>
+              <w:left w:val="nil"/>
+              <w:right w:val="nil"/>
+            </w:tcBorders>
+          </w:tcPr>
+          <w:p/>
+        </w:tc>
+        <w:tc>
+          <w:tcPr>
+            <w:tcW w:type="dxa" w:w="4824"/>
+            <w:shd w:val="clear" w:fill="F4F4F4"/>
+            <w:tcBorders>
+              <w:top w:val="single" w:sz="4" w:space="0" w:color="D4D4D4"/>
+              <w:bottom w:val="single" w:sz="4" w:space="0" w:color="D4D4D4"/>
+              <w:left w:val="single" w:sz="4" w:space="0" w:color="D4D4D4"/>
+              <w:right w:val="single" w:sz="4" w:space="0" w:color="D4D4D4"/>
+            </w:tcBorders>
+            <w:tcMar>
+              <w:top w:w="130" w:type="dxa"/>
+              <w:bottom w:w="130" w:type="dxa"/>
+              <w:left w:w="143" w:type="dxa"/>
+              <w:right w:w="143" w:type="dxa"/>
+            </w:tcMar>
+          </w:tcPr>
           <w:p>
             <w:pPr>
-              <w:spacing w:after="0"/>
+              <w:spacing w:before="0" w:after="60"/>
             </w:pPr>
             <w:r>
               <w:rPr>
                 <w:rFonts w:ascii="Calibri" w:hAnsi="Calibri"/>
                 <w:b/>
-                <w:color w:val="1F2328"/>
-                <w:sz w:val="21"/>
-              </w:rPr>
-              <w:t>{{ reseller_info }}</w:t>
-            </w:r>
-          </w:p>
-        </w:tc>
-      </w:tr>
-      <w:tr>
-        <w:tc>
-          <w:tcPr>
-            <w:tcW w:type="dxa" w:w="5040"/>
-            <w:shd w:val="clear" w:fill="F7F7FB"/>
-          </w:tcPr>
-          <w:p>
-            <w:pPr>
-              <w:spacing w:after="20"/>
-            </w:pPr>
-            <w:r>
-              <w:rPr>
-                <w:rFonts w:ascii="Calibri" w:hAnsi="Calibri"/>
-                <w:b/>
-                <w:caps/>
-                <w:color w:val="6B7280"/>
-                <w:sz w:val="15"/>
-              </w:rPr>
-              <w:t>Payment Status</w:t>
-            </w:r>
-          </w:p>
-          <w:p>
-            <w:pPr>
-              <w:spacing w:after="0"/>
-            </w:pPr>
-            <w:r>
-              <w:rPr>
-                <w:rFonts w:ascii="Calibri" w:hAnsi="Calibri"/>
-                <w:b/>
-                <w:color w:val="1F2328"/>
-                <w:sz w:val="21"/>
-              </w:rPr>
-              <w:t>{{ payment_status }}</w:t>
-            </w:r>
-          </w:p>
-        </w:tc>
-        <w:tc>
-          <w:tcPr>
-            <w:tcW w:type="dxa" w:w="5040"/>
-            <w:shd w:val="clear" w:fill="F7F7FB"/>
-          </w:tcPr>
-          <w:p>
-            <w:pPr>
-              <w:spacing w:after="20"/>
-            </w:pPr>
-            <w:r>
-              <w:rPr>
-                <w:rFonts w:ascii="Calibri" w:hAnsi="Calibri"/>
-                <w:b/>
-                <w:caps/>
-                <w:color w:val="6B7280"/>
-                <w:sz w:val="15"/>
+                <w:color w:val="111111"/>
+                <w:sz w:val="19"/>
               </w:rPr>
               <w:t>Shipping Status</w:t>
             </w:r>
           </w:p>
-          <w:p>
-            <w:pPr>
-              <w:spacing w:after="0"/>
-            </w:pPr>
-            <w:r>
-              <w:rPr>
-                <w:rFonts w:ascii="Calibri" w:hAnsi="Calibri"/>
-                <w:b/>
-                <w:color w:val="1F2328"/>
-                <w:sz w:val="21"/>
-              </w:rPr>
-              <w:t>{{ shipping_status }}</w:t>
-            </w:r>
-          </w:p>
+          <w:tbl>
+            <w:tblPr>
+              <w:tblW w:type="auto" w:w="0"/>
+              <w:tblLayout w:type="fixed"/>
+              <w:tblLook w:firstColumn="1" w:firstRow="1" w:lastColumn="0" w:lastRow="0" w:noHBand="0" w:noVBand="1" w:val="04A0"/>
+            </w:tblPr>
+            <w:tblGrid>
+              <w:gridCol w:w="4824"/>
+            </w:tblGrid>
+            <w:tr>
+              <w:tc>
+                <w:tcPr>
+                  <w:tcW w:type="dxa" w:w="2232"/>
+                  <w:shd w:val="clear" w:fill="FFFFFF"/>
+                  <w:tcBorders>
+                    <w:top w:val="single" w:sz="4" w:space="0" w:color="BFBFBF"/>
+                    <w:bottom w:val="single" w:sz="4" w:space="0" w:color="BFBFBF"/>
+                    <w:left w:val="single" w:sz="4" w:space="0" w:color="BFBFBF"/>
+                    <w:right w:val="single" w:sz="4" w:space="0" w:color="BFBFBF"/>
+                  </w:tcBorders>
+                  <w:tcMar>
+                    <w:top w:w="70" w:type="dxa"/>
+                    <w:bottom w:w="70" w:type="dxa"/>
+                    <w:left w:w="77" w:type="dxa"/>
+                    <w:right w:w="77" w:type="dxa"/>
+                  </w:tcMar>
+                </w:tcPr>
+                <w:p>
+                  <w:pPr>
+                    <w:spacing w:before="0" w:after="0"/>
+                    <w:jc w:val="center"/>
+                  </w:pPr>
+                  <w:r>
+                    <w:rPr>
+                      <w:rFonts w:ascii="Calibri" w:hAnsi="Calibri"/>
+                      <w:b w:val="0"/>
+                      <w:color w:val="333333"/>
+                      <w:sz w:val="19"/>
+                    </w:rPr>
+                    <w:t>{{ shipping_status }}</w:t>
+                  </w:r>
+                </w:p>
+              </w:tc>
+            </w:tr>
+          </w:tbl>
+          <w:p/>
         </w:tc>
       </w:tr>
     </w:tbl>
-    <w:p/>
     <w:p>
       <w:pPr>
-        <w:spacing w:after="80"/>
+        <w:spacing w:before="0" w:after="200"/>
+      </w:pPr>
+    </w:p>
+    <w:p>
+      <w:pPr>
+        <w:spacing w:before="0" w:after="100"/>
       </w:pPr>
       <w:r>
         <w:rPr>
           <w:rFonts w:ascii="Calibri" w:hAnsi="Calibri"/>
           <w:b/>
-          <w:color w:val="1F2328"/>
-          <w:sz w:val="24"/>
+          <w:color w:val="111111"/>
+          <w:sz w:val="25"/>
         </w:rPr>
         <w:t>Products</w:t>
       </w:r>
     </w:p>
     <w:tbl>
       <w:tblPr>
-        <w:tblStyle w:val="TableGrid"/>
         <w:tblW w:type="auto" w:w="0"/>
+        <w:tblLayout w:type="fixed"/>
         <w:tblLook w:firstColumn="1" w:firstRow="1" w:lastColumn="0" w:lastRow="0" w:noHBand="0" w:noVBand="1" w:val="04A0"/>
       </w:tblPr>
       <w:tblGrid>
@@ -286,20 +490,33 @@
       <w:tr>
         <w:tc>
           <w:tcPr>
-            <w:tcW w:type="dxa" w:w="1368"/>
-            <w:shd w:val="clear" w:fill="4F46E5"/>
+            <w:tcW w:type="dxa" w:w="1512"/>
+            <w:shd w:val="clear" w:fill="EDEDED"/>
+            <w:tcBorders>
+              <w:top w:val="single" w:sz="4" w:space="0" w:color="D4D4D4"/>
+              <w:bottom w:val="single" w:sz="4" w:space="0" w:color="D4D4D4"/>
+              <w:left w:val="nil"/>
+              <w:right w:val="nil"/>
+            </w:tcBorders>
+            <w:tcMar>
+              <w:top w:w="90" w:type="dxa"/>
+              <w:bottom w:w="90" w:type="dxa"/>
+              <w:left w:w="99" w:type="dxa"/>
+              <w:right w:w="99" w:type="dxa"/>
+            </w:tcMar>
           </w:tcPr>
           <w:p>
             <w:pPr>
-              <w:spacing w:after="40" w:before="40"/>
+              <w:spacing w:before="0" w:after="0"/>
             </w:pPr>
             <w:r>
               <w:rPr>
                 <w:rFonts w:ascii="Calibri" w:hAnsi="Calibri"/>
                 <w:b/>
                 <w:caps/>
-                <w:color w:val="FFFFFF"/>
-                <w:sz w:val="17"/>
+                <w:color w:val="707070"/>
+                <w:sz w:val="15"/>
+                <w:spacing w:val="12"/>
               </w:rPr>
               <w:t>CODE</w:t>
             </w:r>
@@ -307,20 +524,33 @@
         </w:tc>
         <w:tc>
           <w:tcPr>
-            <w:tcW w:type="dxa" w:w="4176"/>
-            <w:shd w:val="clear" w:fill="4F46E5"/>
+            <w:tcW w:type="dxa" w:w="4248"/>
+            <w:shd w:val="clear" w:fill="EDEDED"/>
+            <w:tcBorders>
+              <w:top w:val="single" w:sz="4" w:space="0" w:color="D4D4D4"/>
+              <w:bottom w:val="single" w:sz="4" w:space="0" w:color="D4D4D4"/>
+              <w:left w:val="nil"/>
+              <w:right w:val="nil"/>
+            </w:tcBorders>
+            <w:tcMar>
+              <w:top w:w="90" w:type="dxa"/>
+              <w:bottom w:w="90" w:type="dxa"/>
+              <w:left w:w="99" w:type="dxa"/>
+              <w:right w:w="99" w:type="dxa"/>
+            </w:tcMar>
           </w:tcPr>
           <w:p>
             <w:pPr>
-              <w:spacing w:after="40" w:before="40"/>
+              <w:spacing w:before="0" w:after="0"/>
             </w:pPr>
             <w:r>
               <w:rPr>
                 <w:rFonts w:ascii="Calibri" w:hAnsi="Calibri"/>
                 <w:b/>
                 <w:caps/>
-                <w:color w:val="FFFFFF"/>
-                <w:sz w:val="17"/>
+                <w:color w:val="707070"/>
+                <w:sz w:val="15"/>
+                <w:spacing w:val="12"/>
               </w:rPr>
               <w:t>PRODUCT</w:t>
             </w:r>
@@ -328,12 +558,24 @@
         </w:tc>
         <w:tc>
           <w:tcPr>
-            <w:tcW w:type="dxa" w:w="864"/>
-            <w:shd w:val="clear" w:fill="4F46E5"/>
+            <w:tcW w:type="dxa" w:w="1008"/>
+            <w:shd w:val="clear" w:fill="EDEDED"/>
+            <w:tcBorders>
+              <w:top w:val="single" w:sz="4" w:space="0" w:color="D4D4D4"/>
+              <w:bottom w:val="single" w:sz="4" w:space="0" w:color="D4D4D4"/>
+              <w:left w:val="nil"/>
+              <w:right w:val="nil"/>
+            </w:tcBorders>
+            <w:tcMar>
+              <w:top w:w="90" w:type="dxa"/>
+              <w:bottom w:w="90" w:type="dxa"/>
+              <w:left w:w="99" w:type="dxa"/>
+              <w:right w:w="99" w:type="dxa"/>
+            </w:tcMar>
           </w:tcPr>
           <w:p>
             <w:pPr>
-              <w:spacing w:after="40" w:before="40"/>
+              <w:spacing w:before="0" w:after="0"/>
               <w:jc w:val="right"/>
             </w:pPr>
             <w:r>
@@ -341,8 +583,9 @@
                 <w:rFonts w:ascii="Calibri" w:hAnsi="Calibri"/>
                 <w:b/>
                 <w:caps/>
-                <w:color w:val="FFFFFF"/>
-                <w:sz w:val="17"/>
+                <w:color w:val="707070"/>
+                <w:sz w:val="15"/>
+                <w:spacing w:val="12"/>
               </w:rPr>
               <w:t>QTY</w:t>
             </w:r>
@@ -351,11 +594,23 @@
         <w:tc>
           <w:tcPr>
             <w:tcW w:type="dxa" w:w="1656"/>
-            <w:shd w:val="clear" w:fill="4F46E5"/>
+            <w:shd w:val="clear" w:fill="EDEDED"/>
+            <w:tcBorders>
+              <w:top w:val="single" w:sz="4" w:space="0" w:color="D4D4D4"/>
+              <w:bottom w:val="single" w:sz="4" w:space="0" w:color="D4D4D4"/>
+              <w:left w:val="nil"/>
+              <w:right w:val="nil"/>
+            </w:tcBorders>
+            <w:tcMar>
+              <w:top w:w="90" w:type="dxa"/>
+              <w:bottom w:w="90" w:type="dxa"/>
+              <w:left w:w="99" w:type="dxa"/>
+              <w:right w:w="99" w:type="dxa"/>
+            </w:tcMar>
           </w:tcPr>
           <w:p>
             <w:pPr>
-              <w:spacing w:after="40" w:before="40"/>
+              <w:spacing w:before="0" w:after="0"/>
               <w:jc w:val="right"/>
             </w:pPr>
             <w:r>
@@ -363,8 +618,9 @@
                 <w:rFonts w:ascii="Calibri" w:hAnsi="Calibri"/>
                 <w:b/>
                 <w:caps/>
-                <w:color w:val="FFFFFF"/>
-                <w:sz w:val="17"/>
+                <w:color w:val="707070"/>
+                <w:sz w:val="15"/>
+                <w:spacing w:val="12"/>
               </w:rPr>
               <w:t>UNIT PRICE</w:t>
             </w:r>
@@ -372,12 +628,24 @@
         </w:tc>
         <w:tc>
           <w:tcPr>
-            <w:tcW w:type="dxa" w:w="1800"/>
-            <w:shd w:val="clear" w:fill="4F46E5"/>
+            <w:tcW w:type="dxa" w:w="1656"/>
+            <w:shd w:val="clear" w:fill="EDEDED"/>
+            <w:tcBorders>
+              <w:top w:val="single" w:sz="4" w:space="0" w:color="D4D4D4"/>
+              <w:bottom w:val="single" w:sz="4" w:space="0" w:color="D4D4D4"/>
+              <w:left w:val="nil"/>
+              <w:right w:val="nil"/>
+            </w:tcBorders>
+            <w:tcMar>
+              <w:top w:w="90" w:type="dxa"/>
+              <w:bottom w:w="90" w:type="dxa"/>
+              <w:left w:w="99" w:type="dxa"/>
+              <w:right w:w="99" w:type="dxa"/>
+            </w:tcMar>
           </w:tcPr>
           <w:p>
             <w:pPr>
-              <w:spacing w:after="40" w:before="40"/>
+              <w:spacing w:before="0" w:after="0"/>
               <w:jc w:val="right"/>
             </w:pPr>
             <w:r>
@@ -385,8 +653,9 @@
                 <w:rFonts w:ascii="Calibri" w:hAnsi="Calibri"/>
                 <w:b/>
                 <w:caps/>
-                <w:color w:val="FFFFFF"/>
-                <w:sz w:val="17"/>
+                <w:color w:val="707070"/>
+                <w:sz w:val="15"/>
+                <w:spacing w:val="12"/>
               </w:rPr>
               <w:t>LINE TOTAL</w:t>
             </w:r>
@@ -396,15 +665,24 @@
       <w:tr>
         <w:tc>
           <w:tcPr>
-            <w:tcW w:type="dxa" w:w="1368"/>
+            <w:tcW w:type="dxa" w:w="1512"/>
+            <w:tcBorders>
+              <w:top w:val="nil"/>
+              <w:bottom w:val="nil"/>
+              <w:left w:val="nil"/>
+              <w:right w:val="nil"/>
+            </w:tcBorders>
           </w:tcPr>
           <w:p>
+            <w:pPr>
+              <w:spacing w:before="0" w:after="0"/>
+            </w:pPr>
             <w:r>
               <w:rPr>
                 <w:rFonts w:ascii="Calibri" w:hAnsi="Calibri"/>
                 <w:b w:val="0"/>
-                <w:color w:val="1F2328"/>
-                <w:sz w:val="18"/>
+                <w:color w:val="111111"/>
+                <w:sz w:val="16"/>
               </w:rPr>
               <w:t>{%tr for item in items %}</w:t>
             </w:r>
@@ -412,25 +690,49 @@
         </w:tc>
         <w:tc>
           <w:tcPr>
-            <w:tcW w:type="dxa" w:w="4176"/>
+            <w:tcW w:type="dxa" w:w="4248"/>
+            <w:tcBorders>
+              <w:top w:val="nil"/>
+              <w:bottom w:val="nil"/>
+              <w:left w:val="nil"/>
+              <w:right w:val="nil"/>
+            </w:tcBorders>
           </w:tcPr>
           <w:p/>
         </w:tc>
         <w:tc>
           <w:tcPr>
-            <w:tcW w:type="dxa" w:w="864"/>
+            <w:tcW w:type="dxa" w:w="1008"/>
+            <w:tcBorders>
+              <w:top w:val="nil"/>
+              <w:bottom w:val="nil"/>
+              <w:left w:val="nil"/>
+              <w:right w:val="nil"/>
+            </w:tcBorders>
           </w:tcPr>
           <w:p/>
         </w:tc>
         <w:tc>
           <w:tcPr>
             <w:tcW w:type="dxa" w:w="1656"/>
+            <w:tcBorders>
+              <w:top w:val="nil"/>
+              <w:bottom w:val="nil"/>
+              <w:left w:val="nil"/>
+              <w:right w:val="nil"/>
+            </w:tcBorders>
           </w:tcPr>
           <w:p/>
         </w:tc>
         <w:tc>
           <w:tcPr>
-            <w:tcW w:type="dxa" w:w="1800"/>
+            <w:tcW w:type="dxa" w:w="1656"/>
+            <w:tcBorders>
+              <w:top w:val="nil"/>
+              <w:bottom w:val="nil"/>
+              <w:left w:val="nil"/>
+              <w:right w:val="nil"/>
+            </w:tcBorders>
           </w:tcPr>
           <w:p/>
         </w:tc>
@@ -438,17 +740,29 @@
       <w:tr>
         <w:tc>
           <w:tcPr>
-            <w:tcW w:type="dxa" w:w="1368"/>
+            <w:tcW w:type="dxa" w:w="1512"/>
+            <w:tcBorders>
+              <w:top w:val="nil"/>
+              <w:bottom w:val="single" w:sz="4" w:space="0" w:color="D4D4D4"/>
+              <w:left w:val="nil"/>
+              <w:right w:val="nil"/>
+            </w:tcBorders>
+            <w:tcMar>
+              <w:top w:w="105" w:type="dxa"/>
+              <w:bottom w:w="105" w:type="dxa"/>
+              <w:left w:w="115" w:type="dxa"/>
+              <w:right w:w="115" w:type="dxa"/>
+            </w:tcMar>
           </w:tcPr>
           <w:p>
             <w:pPr>
-              <w:spacing w:after="40" w:before="40"/>
+              <w:spacing w:before="0" w:after="0"/>
             </w:pPr>
             <w:r>
               <w:rPr>
                 <w:rFonts w:ascii="Calibri" w:hAnsi="Calibri"/>
-                <w:b/>
-                <w:color w:val="1F2328"/>
+                <w:b w:val="0"/>
+                <w:color w:val="333333"/>
                 <w:sz w:val="20"/>
               </w:rPr>
               <w:t>{{ item.code }}</w:t>
@@ -457,17 +771,29 @@
         </w:tc>
         <w:tc>
           <w:tcPr>
-            <w:tcW w:type="dxa" w:w="4176"/>
+            <w:tcW w:type="dxa" w:w="4248"/>
+            <w:tcBorders>
+              <w:top w:val="nil"/>
+              <w:bottom w:val="single" w:sz="4" w:space="0" w:color="D4D4D4"/>
+              <w:left w:val="nil"/>
+              <w:right w:val="nil"/>
+            </w:tcBorders>
+            <w:tcMar>
+              <w:top w:w="105" w:type="dxa"/>
+              <w:bottom w:w="105" w:type="dxa"/>
+              <w:left w:w="115" w:type="dxa"/>
+              <w:right w:w="115" w:type="dxa"/>
+            </w:tcMar>
           </w:tcPr>
           <w:p>
             <w:pPr>
-              <w:spacing w:after="40" w:before="40"/>
+              <w:spacing w:before="0" w:after="0"/>
             </w:pPr>
             <w:r>
               <w:rPr>
                 <w:rFonts w:ascii="Calibri" w:hAnsi="Calibri"/>
                 <w:b w:val="0"/>
-                <w:color w:val="1F2328"/>
+                <w:color w:val="333333"/>
                 <w:sz w:val="20"/>
               </w:rPr>
               <w:t>{{ item.product }}</w:t>
@@ -476,18 +802,30 @@
         </w:tc>
         <w:tc>
           <w:tcPr>
-            <w:tcW w:type="dxa" w:w="864"/>
+            <w:tcW w:type="dxa" w:w="1008"/>
+            <w:tcBorders>
+              <w:top w:val="nil"/>
+              <w:bottom w:val="single" w:sz="4" w:space="0" w:color="D4D4D4"/>
+              <w:left w:val="nil"/>
+              <w:right w:val="nil"/>
+            </w:tcBorders>
+            <w:tcMar>
+              <w:top w:w="105" w:type="dxa"/>
+              <w:bottom w:w="105" w:type="dxa"/>
+              <w:left w:w="115" w:type="dxa"/>
+              <w:right w:w="115" w:type="dxa"/>
+            </w:tcMar>
           </w:tcPr>
           <w:p>
             <w:pPr>
-              <w:spacing w:after="40" w:before="40"/>
+              <w:spacing w:before="0" w:after="0"/>
               <w:jc w:val="right"/>
             </w:pPr>
             <w:r>
               <w:rPr>
                 <w:rFonts w:ascii="Calibri" w:hAnsi="Calibri"/>
                 <w:b w:val="0"/>
-                <w:color w:val="1F2328"/>
+                <w:color w:val="333333"/>
                 <w:sz w:val="20"/>
               </w:rPr>
               <w:t>{{ item.qty }}</w:t>
@@ -497,17 +835,29 @@
         <w:tc>
           <w:tcPr>
             <w:tcW w:type="dxa" w:w="1656"/>
+            <w:tcBorders>
+              <w:top w:val="nil"/>
+              <w:bottom w:val="single" w:sz="4" w:space="0" w:color="D4D4D4"/>
+              <w:left w:val="nil"/>
+              <w:right w:val="nil"/>
+            </w:tcBorders>
+            <w:tcMar>
+              <w:top w:w="105" w:type="dxa"/>
+              <w:bottom w:w="105" w:type="dxa"/>
+              <w:left w:w="115" w:type="dxa"/>
+              <w:right w:w="115" w:type="dxa"/>
+            </w:tcMar>
           </w:tcPr>
           <w:p>
             <w:pPr>
-              <w:spacing w:after="40" w:before="40"/>
+              <w:spacing w:before="0" w:after="0"/>
               <w:jc w:val="right"/>
             </w:pPr>
             <w:r>
               <w:rPr>
                 <w:rFonts w:ascii="Calibri" w:hAnsi="Calibri"/>
                 <w:b w:val="0"/>
-                <w:color w:val="1F2328"/>
+                <w:color w:val="333333"/>
                 <w:sz w:val="20"/>
               </w:rPr>
               <w:t>{{ item.unit_price }}</w:t>
@@ -516,18 +866,30 @@
         </w:tc>
         <w:tc>
           <w:tcPr>
-            <w:tcW w:type="dxa" w:w="1800"/>
+            <w:tcW w:type="dxa" w:w="1656"/>
+            <w:tcBorders>
+              <w:top w:val="nil"/>
+              <w:bottom w:val="single" w:sz="4" w:space="0" w:color="D4D4D4"/>
+              <w:left w:val="nil"/>
+              <w:right w:val="nil"/>
+            </w:tcBorders>
+            <w:tcMar>
+              <w:top w:w="105" w:type="dxa"/>
+              <w:bottom w:w="105" w:type="dxa"/>
+              <w:left w:w="115" w:type="dxa"/>
+              <w:right w:w="115" w:type="dxa"/>
+            </w:tcMar>
           </w:tcPr>
           <w:p>
             <w:pPr>
-              <w:spacing w:after="40" w:before="40"/>
+              <w:spacing w:before="0" w:after="0"/>
               <w:jc w:val="right"/>
             </w:pPr>
             <w:r>
               <w:rPr>
                 <w:rFonts w:ascii="Calibri" w:hAnsi="Calibri"/>
                 <w:b w:val="0"/>
-                <w:color w:val="1F2328"/>
+                <w:color w:val="333333"/>
                 <w:sz w:val="20"/>
               </w:rPr>
               <w:t>{{ item.line_total }}</w:t>
@@ -538,15 +900,24 @@
       <w:tr>
         <w:tc>
           <w:tcPr>
-            <w:tcW w:type="dxa" w:w="1368"/>
+            <w:tcW w:type="dxa" w:w="1512"/>
+            <w:tcBorders>
+              <w:top w:val="nil"/>
+              <w:bottom w:val="nil"/>
+              <w:left w:val="nil"/>
+              <w:right w:val="nil"/>
+            </w:tcBorders>
           </w:tcPr>
           <w:p>
+            <w:pPr>
+              <w:spacing w:before="0" w:after="0"/>
+            </w:pPr>
             <w:r>
               <w:rPr>
                 <w:rFonts w:ascii="Calibri" w:hAnsi="Calibri"/>
                 <w:b w:val="0"/>
-                <w:color w:val="1F2328"/>
-                <w:sz w:val="18"/>
+                <w:color w:val="111111"/>
+                <w:sz w:val="16"/>
               </w:rPr>
               <w:t>{%tr endfor %}</w:t>
             </w:r>
@@ -554,72 +925,86 @@
         </w:tc>
         <w:tc>
           <w:tcPr>
-            <w:tcW w:type="dxa" w:w="4176"/>
+            <w:tcW w:type="dxa" w:w="4248"/>
+            <w:tcBorders>
+              <w:top w:val="nil"/>
+              <w:bottom w:val="nil"/>
+              <w:left w:val="nil"/>
+              <w:right w:val="nil"/>
+            </w:tcBorders>
           </w:tcPr>
           <w:p/>
         </w:tc>
         <w:tc>
           <w:tcPr>
-            <w:tcW w:type="dxa" w:w="864"/>
+            <w:tcW w:type="dxa" w:w="1008"/>
+            <w:tcBorders>
+              <w:top w:val="nil"/>
+              <w:bottom w:val="nil"/>
+              <w:left w:val="nil"/>
+              <w:right w:val="nil"/>
+            </w:tcBorders>
           </w:tcPr>
           <w:p/>
         </w:tc>
         <w:tc>
           <w:tcPr>
             <w:tcW w:type="dxa" w:w="1656"/>
+            <w:tcBorders>
+              <w:top w:val="nil"/>
+              <w:bottom w:val="nil"/>
+              <w:left w:val="nil"/>
+              <w:right w:val="nil"/>
+            </w:tcBorders>
           </w:tcPr>
           <w:p/>
         </w:tc>
         <w:tc>
           <w:tcPr>
-            <w:tcW w:type="dxa" w:w="1800"/>
+            <w:tcW w:type="dxa" w:w="1656"/>
+            <w:tcBorders>
+              <w:top w:val="nil"/>
+              <w:bottom w:val="nil"/>
+              <w:left w:val="nil"/>
+              <w:right w:val="nil"/>
+            </w:tcBorders>
           </w:tcPr>
           <w:p/>
         </w:tc>
       </w:tr>
     </w:tbl>
-    <w:p/>
     <w:p>
       <w:pPr>
+        <w:spacing w:before="0" w:after="200"/>
+      </w:pPr>
+    </w:p>
+    <w:p>
+      <w:pPr>
+        <w:spacing w:before="0" w:after="0"/>
         <w:jc w:val="right"/>
       </w:pPr>
       <w:r>
         <w:rPr>
           <w:rFonts w:ascii="Calibri" w:hAnsi="Calibri"/>
           <w:b/>
-          <w:color w:val="6B7280"/>
-          <w:sz w:val="26"/>
+          <w:color w:val="111111"/>
+          <w:sz w:val="28"/>
         </w:rPr>
-        <w:t xml:space="preserve">Order Total:  </w:t>
+        <w:t xml:space="preserve">Order Total: </w:t>
       </w:r>
       <w:r>
         <w:rPr>
           <w:rFonts w:ascii="Calibri" w:hAnsi="Calibri"/>
           <w:b/>
-          <w:color w:val="4F46E5"/>
-          <w:sz w:val="30"/>
+          <w:color w:val="111111"/>
+          <w:sz w:val="28"/>
         </w:rPr>
         <w:t>{{ order_total }}</w:t>
       </w:r>
     </w:p>
-    <w:p/>
-    <w:p>
-      <w:pPr>
-        <w:jc w:val="center"/>
-      </w:pPr>
-      <w:r>
-        <w:rPr>
-          <w:rFonts w:ascii="Calibri" w:hAnsi="Calibri"/>
-          <w:b w:val="0"/>
-          <w:color w:val="6B7280"/>
-          <w:sz w:val="17"/>
-        </w:rPr>
-        <w:t>Thank you for your order. Payment details available on request.</w:t>
-      </w:r>
-    </w:p>
     <w:sectPr>
       <w:pgSz w:w="12240" w:h="15840"/>
-      <w:pgMar w:top="1008" w:right="1080" w:bottom="1008" w:left="1080" w:header="720" w:footer="720" w:gutter="0"/>
+      <w:pgMar w:top="1080" w:right="1080" w:bottom="1080" w:left="1080" w:header="720" w:footer="720" w:gutter="0"/>
       <w:cols w:space="720"/>
       <w:docGrid w:linePitch="360"/>
     </w:sectPr>
@@ -990,6 +1375,10 @@
     <w:name w:val="Normal"/>
     <w:qFormat/>
     <w:rsid w:val="00FC693F"/>
+    <w:rPr>
+      <w:rFonts w:ascii="Calibri" w:hAnsi="Calibri"/>
+      <w:sz w:val="20"/>
+    </w:rPr>
   </w:style>
   <w:style w:type="paragraph" w:styleId="Header">
     <w:name w:val="header"/>

</xml_diff>

<commit_message>
Refine invoice design: stronger hierarchy and heavier rules
- Stack INVOICE / number / date on the right, heavy full-width masthead rule
- Dark header band on the products table, built as one merged cell with tab
  stops so it renders without hairline seams at cell joins
- Bold product codes and line totals; uppercase letterspaced labels
- Totals block in a single cell with a 2pt rule above
- Fix w:tcPr child ordering, zero cell spacing, fixed table layout
</commit_message>
<xml_diff>
--- a/template.docx
+++ b/template.docx
@@ -7,6 +7,8 @@
         <w:tblW w:type="auto" w:w="0"/>
         <w:tblLayout w:type="fixed"/>
         <w:tblLook w:firstColumn="1" w:firstRow="1" w:lastColumn="0" w:lastRow="0" w:noHBand="0" w:noVBand="1" w:val="04A0"/>
+        <w:tblLayout w:type="fixed"/>
+        <w:tblCellSpacing w:w="0" w:type="dxa"/>
       </w:tblPr>
       <w:tblGrid>
         <w:gridCol w:w="5040"/>
@@ -15,7 +17,34 @@
       <w:tr>
         <w:tc>
           <w:tcPr>
-            <w:tcW w:type="dxa" w:w="6048"/>
+            <w:tcW w:type="dxa" w:w="5760"/>
+            <w:vMerge w:val="restart"/>
+            <w:tcBorders>
+              <w:top w:val="nil"/>
+              <w:bottom w:val="nil"/>
+              <w:left w:val="nil"/>
+              <w:right w:val="nil"/>
+            </w:tcBorders>
+            <w:vAlign w:val="center"/>
+          </w:tcPr>
+          <w:p>
+            <w:pPr>
+              <w:spacing w:before="0" w:after="0"/>
+            </w:pPr>
+            <w:r>
+              <w:rPr>
+                <w:rFonts w:ascii="Calibri" w:hAnsi="Calibri"/>
+                <w:b/>
+                <w:color w:val="111111"/>
+                <w:sz w:val="42"/>
+              </w:rPr>
+              <w:t>{{ company_name }}</w:t>
+            </w:r>
+          </w:p>
+        </w:tc>
+        <w:tc>
+          <w:tcPr>
+            <w:tcW w:type="dxa" w:w="4320"/>
             <w:tcBorders>
               <w:top w:val="nil"/>
               <w:bottom w:val="nil"/>
@@ -26,21 +55,39 @@
           <w:p>
             <w:pPr>
               <w:spacing w:before="0" w:after="0"/>
+              <w:jc w:val="right"/>
             </w:pPr>
             <w:r>
               <w:rPr>
                 <w:rFonts w:ascii="Calibri" w:hAnsi="Calibri"/>
                 <w:b/>
-                <w:color w:val="111111"/>
-                <w:sz w:val="36"/>
+                <w:caps/>
+                <w:color w:val="737373"/>
+                <w:sz w:val="20"/>
+                <w:spacing w:val="60"/>
               </w:rPr>
-              <w:t>{{ company_name }}</w:t>
+              <w:t>Invoice</w:t>
             </w:r>
           </w:p>
         </w:tc>
+      </w:tr>
+      <w:tr>
         <w:tc>
           <w:tcPr>
-            <w:tcW w:type="dxa" w:w="4032"/>
+            <w:tcW w:type="dxa" w:w="5760"/>
+            <w:vMerge/>
+            <w:tcBorders>
+              <w:top w:val="nil"/>
+              <w:bottom w:val="nil"/>
+              <w:left w:val="nil"/>
+              <w:right w:val="nil"/>
+            </w:tcBorders>
+          </w:tcPr>
+          <w:p/>
+        </w:tc>
+        <w:tc>
+          <w:tcPr>
+            <w:tcW w:type="dxa" w:w="4320"/>
             <w:tcBorders>
               <w:top w:val="nil"/>
               <w:bottom w:val="nil"/>
@@ -58,7 +105,7 @@
                 <w:rFonts w:ascii="Calibri" w:hAnsi="Calibri"/>
                 <w:b/>
                 <w:color w:val="111111"/>
-                <w:sz w:val="36"/>
+                <w:sz w:val="34"/>
               </w:rPr>
               <w:t>{{ invoice_number }}</w:t>
             </w:r>
@@ -68,35 +115,23 @@
       <w:tr>
         <w:tc>
           <w:tcPr>
-            <w:tcW w:type="dxa" w:w="6048"/>
+            <w:tcW w:type="dxa" w:w="5760"/>
+            <w:vMerge/>
             <w:tcBorders>
               <w:top w:val="nil"/>
-              <w:bottom w:val="single" w:sz="4" w:space="0" w:color="D4D4D4"/>
+              <w:bottom w:val="nil"/>
               <w:left w:val="nil"/>
               <w:right w:val="nil"/>
             </w:tcBorders>
           </w:tcPr>
-          <w:p>
-            <w:pPr>
-              <w:spacing w:before="0" w:after="0"/>
-            </w:pPr>
-            <w:r>
-              <w:rPr>
-                <w:rFonts w:ascii="Calibri" w:hAnsi="Calibri"/>
-                <w:b w:val="0"/>
-                <w:color w:val="707070"/>
-                <w:sz w:val="18"/>
-              </w:rPr>
-              <w:t>Invoice</w:t>
-            </w:r>
-          </w:p>
+          <w:p/>
         </w:tc>
         <w:tc>
           <w:tcPr>
-            <w:tcW w:type="dxa" w:w="4032"/>
+            <w:tcW w:type="dxa" w:w="4320"/>
             <w:tcBorders>
               <w:top w:val="nil"/>
-              <w:bottom w:val="single" w:sz="4" w:space="0" w:color="D4D4D4"/>
+              <w:bottom w:val="nil"/>
               <w:left w:val="nil"/>
               <w:right w:val="nil"/>
             </w:tcBorders>
@@ -110,8 +145,8 @@
               <w:rPr>
                 <w:rFonts w:ascii="Calibri" w:hAnsi="Calibri"/>
                 <w:b w:val="0"/>
-                <w:color w:val="707070"/>
-                <w:sz w:val="18"/>
+                <w:color w:val="737373"/>
+                <w:sz w:val="19"/>
               </w:rPr>
               <w:t>{{ invoice_date }}</w:t>
             </w:r>
@@ -121,8 +156,16 @@
     </w:tbl>
     <w:p>
       <w:pPr>
-        <w:spacing w:before="0" w:after="160"/>
+        <w:pBdr>
+          <w:bottom w:val="single" w:sz="16" w:space="1" w:color="222222"/>
+        </w:pBdr>
+        <w:spacing w:before="40" w:after="280"/>
       </w:pPr>
+      <w:r>
+        <w:rPr>
+          <w:sz w:val="4"/>
+        </w:rPr>
+      </w:r>
     </w:p>
     <w:tbl>
       <w:tblPr>
@@ -130,6 +173,8 @@
         <w:jc w:val="center"/>
         <w:tblLayout w:type="fixed"/>
         <w:tblLook w:firstColumn="1" w:firstRow="1" w:lastColumn="0" w:lastRow="0" w:noHBand="0" w:noVBand="1" w:val="04A0"/>
+        <w:tblLayout w:type="fixed"/>
+        <w:tblCellSpacing w:w="0" w:type="dxa"/>
       </w:tblPr>
       <w:tblGrid>
         <w:gridCol w:w="3360"/>
@@ -140,30 +185,32 @@
         <w:tc>
           <w:tcPr>
             <w:tcW w:type="dxa" w:w="4824"/>
-            <w:shd w:val="clear" w:fill="F4F4F4"/>
             <w:tcBorders>
-              <w:top w:val="single" w:sz="4" w:space="0" w:color="D4D4D4"/>
-              <w:bottom w:val="single" w:sz="4" w:space="0" w:color="D4D4D4"/>
-              <w:left w:val="single" w:sz="4" w:space="0" w:color="D4D4D4"/>
-              <w:right w:val="single" w:sz="4" w:space="0" w:color="D4D4D4"/>
+              <w:top w:val="single" w:sz="8" w:space="0" w:color="DCDCDC"/>
+              <w:bottom w:val="single" w:sz="8" w:space="0" w:color="DCDCDC"/>
+              <w:left w:val="single" w:sz="8" w:space="0" w:color="DCDCDC"/>
+              <w:right w:val="single" w:sz="8" w:space="0" w:color="DCDCDC"/>
             </w:tcBorders>
+            <w:shd w:val="clear" w:color="auto" w:fill="F5F5F5"/>
             <w:tcMar>
-              <w:top w:w="130" w:type="dxa"/>
-              <w:bottom w:w="130" w:type="dxa"/>
-              <w:left w:w="143" w:type="dxa"/>
-              <w:right w:w="143" w:type="dxa"/>
+              <w:top w:w="150" w:type="dxa"/>
+              <w:bottom w:w="150" w:type="dxa"/>
+              <w:left w:w="165" w:type="dxa"/>
+              <w:right w:w="165" w:type="dxa"/>
             </w:tcMar>
           </w:tcPr>
           <w:p>
             <w:pPr>
-              <w:spacing w:before="0" w:after="60"/>
+              <w:spacing w:before="0" w:after="80"/>
             </w:pPr>
             <w:r>
               <w:rPr>
                 <w:rFonts w:ascii="Calibri" w:hAnsi="Calibri"/>
                 <w:b/>
-                <w:color w:val="111111"/>
-                <w:sz w:val="19"/>
+                <w:caps/>
+                <w:color w:val="737373"/>
+                <w:sz w:val="15"/>
+                <w:spacing w:val="18"/>
               </w:rPr>
               <w:t>Reseller</w:t>
             </w:r>
@@ -177,7 +224,7 @@
                 <w:rFonts w:ascii="Calibri" w:hAnsi="Calibri"/>
                 <w:b/>
                 <w:color w:val="111111"/>
-                <w:sz w:val="21"/>
+                <w:sz w:val="24"/>
               </w:rPr>
               <w:t>{{ reseller_info }}</w:t>
             </w:r>
@@ -208,30 +255,32 @@
         <w:tc>
           <w:tcPr>
             <w:tcW w:type="dxa" w:w="4824"/>
-            <w:shd w:val="clear" w:fill="F4F4F4"/>
             <w:tcBorders>
-              <w:top w:val="single" w:sz="4" w:space="0" w:color="D4D4D4"/>
-              <w:bottom w:val="single" w:sz="4" w:space="0" w:color="D4D4D4"/>
-              <w:left w:val="single" w:sz="4" w:space="0" w:color="D4D4D4"/>
-              <w:right w:val="single" w:sz="4" w:space="0" w:color="D4D4D4"/>
+              <w:top w:val="single" w:sz="8" w:space="0" w:color="DCDCDC"/>
+              <w:bottom w:val="single" w:sz="8" w:space="0" w:color="DCDCDC"/>
+              <w:left w:val="single" w:sz="8" w:space="0" w:color="DCDCDC"/>
+              <w:right w:val="single" w:sz="8" w:space="0" w:color="DCDCDC"/>
             </w:tcBorders>
+            <w:shd w:val="clear" w:color="auto" w:fill="F5F5F5"/>
             <w:tcMar>
-              <w:top w:w="130" w:type="dxa"/>
-              <w:bottom w:w="130" w:type="dxa"/>
-              <w:left w:w="143" w:type="dxa"/>
-              <w:right w:w="143" w:type="dxa"/>
+              <w:top w:w="150" w:type="dxa"/>
+              <w:bottom w:w="150" w:type="dxa"/>
+              <w:left w:w="165" w:type="dxa"/>
+              <w:right w:w="165" w:type="dxa"/>
             </w:tcMar>
           </w:tcPr>
           <w:p>
             <w:pPr>
-              <w:spacing w:before="0" w:after="60"/>
+              <w:spacing w:before="0" w:after="80"/>
             </w:pPr>
             <w:r>
               <w:rPr>
                 <w:rFonts w:ascii="Calibri" w:hAnsi="Calibri"/>
                 <w:b/>
-                <w:color w:val="111111"/>
-                <w:sz w:val="19"/>
+                <w:caps/>
+                <w:color w:val="737373"/>
+                <w:sz w:val="15"/>
+                <w:spacing w:val="18"/>
               </w:rPr>
               <w:t>Customer / Receiver</w:t>
             </w:r>
@@ -245,20 +294,20 @@
                 <w:rFonts w:ascii="Calibri" w:hAnsi="Calibri"/>
                 <w:b/>
                 <w:color w:val="111111"/>
-                <w:sz w:val="21"/>
+                <w:sz w:val="24"/>
               </w:rPr>
               <w:t>{{ customer_name }}</w:t>
             </w:r>
           </w:p>
           <w:p>
             <w:pPr>
-              <w:spacing w:before="40" w:after="0"/>
+              <w:spacing w:before="60" w:after="0"/>
             </w:pPr>
             <w:r>
               <w:rPr>
                 <w:rFonts w:ascii="Calibri" w:hAnsi="Calibri"/>
                 <w:b w:val="0"/>
-                <w:color w:val="707070"/>
+                <w:color w:val="737373"/>
                 <w:sz w:val="19"/>
               </w:rPr>
               <w:t>{{ customer_address }}</w:t>
@@ -278,6 +327,8 @@
         <w:jc w:val="center"/>
         <w:tblLayout w:type="fixed"/>
         <w:tblLook w:firstColumn="1" w:firstRow="1" w:lastColumn="0" w:lastRow="0" w:noHBand="0" w:noVBand="1" w:val="04A0"/>
+        <w:tblLayout w:type="fixed"/>
+        <w:tblCellSpacing w:w="0" w:type="dxa"/>
       </w:tblPr>
       <w:tblGrid>
         <w:gridCol w:w="3360"/>
@@ -288,30 +339,32 @@
         <w:tc>
           <w:tcPr>
             <w:tcW w:type="dxa" w:w="4824"/>
-            <w:shd w:val="clear" w:fill="F4F4F4"/>
             <w:tcBorders>
-              <w:top w:val="single" w:sz="4" w:space="0" w:color="D4D4D4"/>
-              <w:bottom w:val="single" w:sz="4" w:space="0" w:color="D4D4D4"/>
-              <w:left w:val="single" w:sz="4" w:space="0" w:color="D4D4D4"/>
-              <w:right w:val="single" w:sz="4" w:space="0" w:color="D4D4D4"/>
+              <w:top w:val="single" w:sz="8" w:space="0" w:color="DCDCDC"/>
+              <w:bottom w:val="single" w:sz="8" w:space="0" w:color="DCDCDC"/>
+              <w:left w:val="single" w:sz="8" w:space="0" w:color="DCDCDC"/>
+              <w:right w:val="single" w:sz="8" w:space="0" w:color="DCDCDC"/>
             </w:tcBorders>
+            <w:shd w:val="clear" w:color="auto" w:fill="F5F5F5"/>
             <w:tcMar>
-              <w:top w:w="130" w:type="dxa"/>
-              <w:bottom w:w="130" w:type="dxa"/>
-              <w:left w:w="143" w:type="dxa"/>
-              <w:right w:w="143" w:type="dxa"/>
+              <w:top w:w="150" w:type="dxa"/>
+              <w:bottom w:w="150" w:type="dxa"/>
+              <w:left w:w="165" w:type="dxa"/>
+              <w:right w:w="165" w:type="dxa"/>
             </w:tcMar>
           </w:tcPr>
           <w:p>
             <w:pPr>
-              <w:spacing w:before="0" w:after="60"/>
+              <w:spacing w:before="0" w:after="80"/>
             </w:pPr>
             <w:r>
               <w:rPr>
                 <w:rFonts w:ascii="Calibri" w:hAnsi="Calibri"/>
                 <w:b/>
-                <w:color w:val="111111"/>
-                <w:sz w:val="19"/>
+                <w:caps/>
+                <w:color w:val="737373"/>
+                <w:sz w:val="15"/>
+                <w:spacing w:val="18"/>
               </w:rPr>
               <w:t>Payment Status</w:t>
             </w:r>
@@ -328,19 +381,19 @@
             <w:tr>
               <w:tc>
                 <w:tcPr>
-                  <w:tcW w:type="dxa" w:w="2232"/>
-                  <w:shd w:val="clear" w:fill="FFFFFF"/>
+                  <w:tcW w:type="dxa" w:w="2448"/>
                   <w:tcBorders>
-                    <w:top w:val="single" w:sz="4" w:space="0" w:color="BFBFBF"/>
-                    <w:bottom w:val="single" w:sz="4" w:space="0" w:color="BFBFBF"/>
-                    <w:left w:val="single" w:sz="4" w:space="0" w:color="BFBFBF"/>
-                    <w:right w:val="single" w:sz="4" w:space="0" w:color="BFBFBF"/>
+                    <w:top w:val="single" w:sz="8" w:space="0" w:color="B0B0B0"/>
+                    <w:bottom w:val="single" w:sz="8" w:space="0" w:color="B0B0B0"/>
+                    <w:left w:val="single" w:sz="8" w:space="0" w:color="B0B0B0"/>
+                    <w:right w:val="single" w:sz="8" w:space="0" w:color="B0B0B0"/>
                   </w:tcBorders>
+                  <w:shd w:val="clear" w:color="auto" w:fill="FFFFFF"/>
                   <w:tcMar>
-                    <w:top w:w="70" w:type="dxa"/>
-                    <w:bottom w:w="70" w:type="dxa"/>
-                    <w:left w:w="77" w:type="dxa"/>
-                    <w:right w:w="77" w:type="dxa"/>
+                    <w:top w:w="85" w:type="dxa"/>
+                    <w:bottom w:w="85" w:type="dxa"/>
+                    <w:left w:w="93" w:type="dxa"/>
+                    <w:right w:w="93" w:type="dxa"/>
                   </w:tcMar>
                 </w:tcPr>
                 <w:p>
@@ -351,9 +404,9 @@
                   <w:r>
                     <w:rPr>
                       <w:rFonts w:ascii="Calibri" w:hAnsi="Calibri"/>
-                      <w:b w:val="0"/>
-                      <w:color w:val="333333"/>
-                      <w:sz w:val="19"/>
+                      <w:b/>
+                      <w:color w:val="111111"/>
+                      <w:sz w:val="20"/>
                     </w:rPr>
                     <w:t>{{ payment_status }}</w:t>
                   </w:r>
@@ -378,30 +431,32 @@
         <w:tc>
           <w:tcPr>
             <w:tcW w:type="dxa" w:w="4824"/>
-            <w:shd w:val="clear" w:fill="F4F4F4"/>
             <w:tcBorders>
-              <w:top w:val="single" w:sz="4" w:space="0" w:color="D4D4D4"/>
-              <w:bottom w:val="single" w:sz="4" w:space="0" w:color="D4D4D4"/>
-              <w:left w:val="single" w:sz="4" w:space="0" w:color="D4D4D4"/>
-              <w:right w:val="single" w:sz="4" w:space="0" w:color="D4D4D4"/>
+              <w:top w:val="single" w:sz="8" w:space="0" w:color="DCDCDC"/>
+              <w:bottom w:val="single" w:sz="8" w:space="0" w:color="DCDCDC"/>
+              <w:left w:val="single" w:sz="8" w:space="0" w:color="DCDCDC"/>
+              <w:right w:val="single" w:sz="8" w:space="0" w:color="DCDCDC"/>
             </w:tcBorders>
+            <w:shd w:val="clear" w:color="auto" w:fill="F5F5F5"/>
             <w:tcMar>
-              <w:top w:w="130" w:type="dxa"/>
-              <w:bottom w:w="130" w:type="dxa"/>
-              <w:left w:w="143" w:type="dxa"/>
-              <w:right w:w="143" w:type="dxa"/>
+              <w:top w:w="150" w:type="dxa"/>
+              <w:bottom w:w="150" w:type="dxa"/>
+              <w:left w:w="165" w:type="dxa"/>
+              <w:right w:w="165" w:type="dxa"/>
             </w:tcMar>
           </w:tcPr>
           <w:p>
             <w:pPr>
-              <w:spacing w:before="0" w:after="60"/>
+              <w:spacing w:before="0" w:after="80"/>
             </w:pPr>
             <w:r>
               <w:rPr>
                 <w:rFonts w:ascii="Calibri" w:hAnsi="Calibri"/>
                 <w:b/>
-                <w:color w:val="111111"/>
-                <w:sz w:val="19"/>
+                <w:caps/>
+                <w:color w:val="737373"/>
+                <w:sz w:val="15"/>
+                <w:spacing w:val="18"/>
               </w:rPr>
               <w:t>Shipping Status</w:t>
             </w:r>
@@ -418,19 +473,19 @@
             <w:tr>
               <w:tc>
                 <w:tcPr>
-                  <w:tcW w:type="dxa" w:w="2232"/>
-                  <w:shd w:val="clear" w:fill="FFFFFF"/>
+                  <w:tcW w:type="dxa" w:w="2448"/>
                   <w:tcBorders>
-                    <w:top w:val="single" w:sz="4" w:space="0" w:color="BFBFBF"/>
-                    <w:bottom w:val="single" w:sz="4" w:space="0" w:color="BFBFBF"/>
-                    <w:left w:val="single" w:sz="4" w:space="0" w:color="BFBFBF"/>
-                    <w:right w:val="single" w:sz="4" w:space="0" w:color="BFBFBF"/>
+                    <w:top w:val="single" w:sz="8" w:space="0" w:color="B0B0B0"/>
+                    <w:bottom w:val="single" w:sz="8" w:space="0" w:color="B0B0B0"/>
+                    <w:left w:val="single" w:sz="8" w:space="0" w:color="B0B0B0"/>
+                    <w:right w:val="single" w:sz="8" w:space="0" w:color="B0B0B0"/>
                   </w:tcBorders>
+                  <w:shd w:val="clear" w:color="auto" w:fill="FFFFFF"/>
                   <w:tcMar>
-                    <w:top w:w="70" w:type="dxa"/>
-                    <w:bottom w:w="70" w:type="dxa"/>
-                    <w:left w:w="77" w:type="dxa"/>
-                    <w:right w:w="77" w:type="dxa"/>
+                    <w:top w:w="85" w:type="dxa"/>
+                    <w:bottom w:w="85" w:type="dxa"/>
+                    <w:left w:w="93" w:type="dxa"/>
+                    <w:right w:w="93" w:type="dxa"/>
                   </w:tcMar>
                 </w:tcPr>
                 <w:p>
@@ -441,9 +496,9 @@
                   <w:r>
                     <w:rPr>
                       <w:rFonts w:ascii="Calibri" w:hAnsi="Calibri"/>
-                      <w:b w:val="0"/>
-                      <w:color w:val="333333"/>
-                      <w:sz w:val="19"/>
+                      <w:b/>
+                      <w:color w:val="111111"/>
+                      <w:sz w:val="20"/>
                     </w:rPr>
                     <w:t>{{ shipping_status }}</w:t>
                   </w:r>
@@ -462,14 +517,16 @@
     </w:p>
     <w:p>
       <w:pPr>
-        <w:spacing w:before="0" w:after="100"/>
+        <w:spacing w:before="0" w:after="120"/>
       </w:pPr>
       <w:r>
         <w:rPr>
           <w:rFonts w:ascii="Calibri" w:hAnsi="Calibri"/>
           <w:b/>
+          <w:caps/>
           <w:color w:val="111111"/>
-          <w:sz w:val="25"/>
+          <w:sz w:val="22"/>
+          <w:spacing w:val="30"/>
         </w:rPr>
         <w:t>Products</w:t>
       </w:r>
@@ -479,6 +536,8 @@
         <w:tblW w:type="auto" w:w="0"/>
         <w:tblLayout w:type="fixed"/>
         <w:tblLook w:firstColumn="1" w:firstRow="1" w:lastColumn="0" w:lastRow="0" w:noHBand="0" w:noVBand="1" w:val="04A0"/>
+        <w:tblLayout w:type="fixed"/>
+        <w:tblCellSpacing w:w="0" w:type="dxa"/>
       </w:tblPr>
       <w:tblGrid>
         <w:gridCol w:w="2016"/>
@@ -490,23 +549,30 @@
       <w:tr>
         <w:tc>
           <w:tcPr>
-            <w:tcW w:type="dxa" w:w="1512"/>
-            <w:shd w:val="clear" w:fill="EDEDED"/>
+            <w:tcW w:type="dxa" w:w="10080"/>
+            <w:gridSpan w:val="5"/>
             <w:tcBorders>
-              <w:top w:val="single" w:sz="4" w:space="0" w:color="D4D4D4"/>
-              <w:bottom w:val="single" w:sz="4" w:space="0" w:color="D4D4D4"/>
+              <w:top w:val="single" w:sz="8" w:space="0" w:color="222222"/>
+              <w:bottom w:val="single" w:sz="8" w:space="0" w:color="222222"/>
               <w:left w:val="nil"/>
               <w:right w:val="nil"/>
             </w:tcBorders>
+            <w:shd w:val="clear" w:color="auto" w:fill="222222"/>
             <w:tcMar>
-              <w:top w:w="90" w:type="dxa"/>
-              <w:bottom w:w="90" w:type="dxa"/>
-              <w:left w:w="99" w:type="dxa"/>
-              <w:right w:w="99" w:type="dxa"/>
+              <w:top w:w="115" w:type="dxa"/>
+              <w:bottom w:w="115" w:type="dxa"/>
+              <w:left w:w="126" w:type="dxa"/>
+              <w:right w:w="126" w:type="dxa"/>
             </w:tcMar>
           </w:tcPr>
           <w:p>
             <w:pPr>
+              <w:tabs>
+                <w:tab w:pos="1512" w:val="left"/>
+                <w:tab w:pos="6515" w:val="right"/>
+                <w:tab w:pos="8171" w:val="right"/>
+                <w:tab w:pos="9827" w:val="right"/>
+              </w:tabs>
               <w:spacing w:before="0" w:after="0"/>
             </w:pPr>
             <w:r>
@@ -514,148 +580,89 @@
                 <w:rFonts w:ascii="Calibri" w:hAnsi="Calibri"/>
                 <w:b/>
                 <w:caps/>
-                <w:color w:val="707070"/>
-                <w:sz w:val="15"/>
-                <w:spacing w:val="12"/>
+                <w:color w:val="FFFFFF"/>
+                <w:sz w:val="16"/>
+                <w:spacing w:val="20"/>
               </w:rPr>
               <w:t>CODE</w:t>
             </w:r>
-          </w:p>
-        </w:tc>
-        <w:tc>
-          <w:tcPr>
-            <w:tcW w:type="dxa" w:w="4248"/>
-            <w:shd w:val="clear" w:fill="EDEDED"/>
-            <w:tcBorders>
-              <w:top w:val="single" w:sz="4" w:space="0" w:color="D4D4D4"/>
-              <w:bottom w:val="single" w:sz="4" w:space="0" w:color="D4D4D4"/>
-              <w:left w:val="nil"/>
-              <w:right w:val="nil"/>
-            </w:tcBorders>
-            <w:tcMar>
-              <w:top w:w="90" w:type="dxa"/>
-              <w:bottom w:w="90" w:type="dxa"/>
-              <w:left w:w="99" w:type="dxa"/>
-              <w:right w:w="99" w:type="dxa"/>
-            </w:tcMar>
-          </w:tcPr>
-          <w:p>
-            <w:pPr>
-              <w:spacing w:before="0" w:after="0"/>
-            </w:pPr>
+            <w:r>
+              <w:rPr>
+                <w:rFonts w:ascii="Calibri" w:hAnsi="Calibri"/>
+                <w:b w:val="0"/>
+                <w:color w:val="111111"/>
+                <w:sz w:val="20"/>
+              </w:rPr>
+              <w:tab/>
+            </w:r>
             <w:r>
               <w:rPr>
                 <w:rFonts w:ascii="Calibri" w:hAnsi="Calibri"/>
                 <w:b/>
                 <w:caps/>
-                <w:color w:val="707070"/>
-                <w:sz w:val="15"/>
-                <w:spacing w:val="12"/>
+                <w:color w:val="FFFFFF"/>
+                <w:sz w:val="16"/>
+                <w:spacing w:val="20"/>
               </w:rPr>
               <w:t>PRODUCT</w:t>
             </w:r>
-          </w:p>
-        </w:tc>
-        <w:tc>
-          <w:tcPr>
-            <w:tcW w:type="dxa" w:w="1008"/>
-            <w:shd w:val="clear" w:fill="EDEDED"/>
-            <w:tcBorders>
-              <w:top w:val="single" w:sz="4" w:space="0" w:color="D4D4D4"/>
-              <w:bottom w:val="single" w:sz="4" w:space="0" w:color="D4D4D4"/>
-              <w:left w:val="nil"/>
-              <w:right w:val="nil"/>
-            </w:tcBorders>
-            <w:tcMar>
-              <w:top w:w="90" w:type="dxa"/>
-              <w:bottom w:w="90" w:type="dxa"/>
-              <w:left w:w="99" w:type="dxa"/>
-              <w:right w:w="99" w:type="dxa"/>
-            </w:tcMar>
-          </w:tcPr>
-          <w:p>
-            <w:pPr>
-              <w:spacing w:before="0" w:after="0"/>
-              <w:jc w:val="right"/>
-            </w:pPr>
+            <w:r>
+              <w:rPr>
+                <w:rFonts w:ascii="Calibri" w:hAnsi="Calibri"/>
+                <w:b w:val="0"/>
+                <w:color w:val="111111"/>
+                <w:sz w:val="20"/>
+              </w:rPr>
+              <w:tab/>
+            </w:r>
             <w:r>
               <w:rPr>
                 <w:rFonts w:ascii="Calibri" w:hAnsi="Calibri"/>
                 <w:b/>
                 <w:caps/>
-                <w:color w:val="707070"/>
-                <w:sz w:val="15"/>
-                <w:spacing w:val="12"/>
+                <w:color w:val="FFFFFF"/>
+                <w:sz w:val="16"/>
+                <w:spacing w:val="20"/>
               </w:rPr>
               <w:t>QTY</w:t>
             </w:r>
-          </w:p>
-        </w:tc>
-        <w:tc>
-          <w:tcPr>
-            <w:tcW w:type="dxa" w:w="1656"/>
-            <w:shd w:val="clear" w:fill="EDEDED"/>
-            <w:tcBorders>
-              <w:top w:val="single" w:sz="4" w:space="0" w:color="D4D4D4"/>
-              <w:bottom w:val="single" w:sz="4" w:space="0" w:color="D4D4D4"/>
-              <w:left w:val="nil"/>
-              <w:right w:val="nil"/>
-            </w:tcBorders>
-            <w:tcMar>
-              <w:top w:w="90" w:type="dxa"/>
-              <w:bottom w:w="90" w:type="dxa"/>
-              <w:left w:w="99" w:type="dxa"/>
-              <w:right w:w="99" w:type="dxa"/>
-            </w:tcMar>
-          </w:tcPr>
-          <w:p>
-            <w:pPr>
-              <w:spacing w:before="0" w:after="0"/>
-              <w:jc w:val="right"/>
-            </w:pPr>
+            <w:r>
+              <w:rPr>
+                <w:rFonts w:ascii="Calibri" w:hAnsi="Calibri"/>
+                <w:b w:val="0"/>
+                <w:color w:val="111111"/>
+                <w:sz w:val="20"/>
+              </w:rPr>
+              <w:tab/>
+            </w:r>
             <w:r>
               <w:rPr>
                 <w:rFonts w:ascii="Calibri" w:hAnsi="Calibri"/>
                 <w:b/>
                 <w:caps/>
-                <w:color w:val="707070"/>
-                <w:sz w:val="15"/>
-                <w:spacing w:val="12"/>
+                <w:color w:val="FFFFFF"/>
+                <w:sz w:val="16"/>
+                <w:spacing w:val="20"/>
               </w:rPr>
               <w:t>UNIT PRICE</w:t>
             </w:r>
-          </w:p>
-        </w:tc>
-        <w:tc>
-          <w:tcPr>
-            <w:tcW w:type="dxa" w:w="1656"/>
-            <w:shd w:val="clear" w:fill="EDEDED"/>
-            <w:tcBorders>
-              <w:top w:val="single" w:sz="4" w:space="0" w:color="D4D4D4"/>
-              <w:bottom w:val="single" w:sz="4" w:space="0" w:color="D4D4D4"/>
-              <w:left w:val="nil"/>
-              <w:right w:val="nil"/>
-            </w:tcBorders>
-            <w:tcMar>
-              <w:top w:w="90" w:type="dxa"/>
-              <w:bottom w:w="90" w:type="dxa"/>
-              <w:left w:w="99" w:type="dxa"/>
-              <w:right w:w="99" w:type="dxa"/>
-            </w:tcMar>
-          </w:tcPr>
-          <w:p>
-            <w:pPr>
-              <w:spacing w:before="0" w:after="0"/>
-              <w:jc w:val="right"/>
-            </w:pPr>
+            <w:r>
+              <w:rPr>
+                <w:rFonts w:ascii="Calibri" w:hAnsi="Calibri"/>
+                <w:b w:val="0"/>
+                <w:color w:val="111111"/>
+                <w:sz w:val="20"/>
+              </w:rPr>
+              <w:tab/>
+            </w:r>
             <w:r>
               <w:rPr>
                 <w:rFonts w:ascii="Calibri" w:hAnsi="Calibri"/>
                 <w:b/>
                 <w:caps/>
-                <w:color w:val="707070"/>
-                <w:sz w:val="15"/>
-                <w:spacing w:val="12"/>
+                <w:color w:val="FFFFFF"/>
+                <w:sz w:val="16"/>
+                <w:spacing w:val="20"/>
               </w:rPr>
               <w:t>LINE TOTAL</w:t>
             </w:r>
@@ -743,15 +750,15 @@
             <w:tcW w:type="dxa" w:w="1512"/>
             <w:tcBorders>
               <w:top w:val="nil"/>
-              <w:bottom w:val="single" w:sz="4" w:space="0" w:color="D4D4D4"/>
+              <w:bottom w:val="single" w:sz="4" w:space="0" w:color="DCDCDC"/>
               <w:left w:val="nil"/>
               <w:right w:val="nil"/>
             </w:tcBorders>
             <w:tcMar>
-              <w:top w:w="105" w:type="dxa"/>
-              <w:bottom w:w="105" w:type="dxa"/>
-              <w:left w:w="115" w:type="dxa"/>
-              <w:right w:w="115" w:type="dxa"/>
+              <w:top w:w="115" w:type="dxa"/>
+              <w:bottom w:w="115" w:type="dxa"/>
+              <w:left w:w="126" w:type="dxa"/>
+              <w:right w:w="126" w:type="dxa"/>
             </w:tcMar>
           </w:tcPr>
           <w:p>
@@ -761,8 +768,8 @@
             <w:r>
               <w:rPr>
                 <w:rFonts w:ascii="Calibri" w:hAnsi="Calibri"/>
-                <w:b w:val="0"/>
-                <w:color w:val="333333"/>
+                <w:b/>
+                <w:color w:val="111111"/>
                 <w:sz w:val="20"/>
               </w:rPr>
               <w:t>{{ item.code }}</w:t>
@@ -774,15 +781,15 @@
             <w:tcW w:type="dxa" w:w="4248"/>
             <w:tcBorders>
               <w:top w:val="nil"/>
-              <w:bottom w:val="single" w:sz="4" w:space="0" w:color="D4D4D4"/>
+              <w:bottom w:val="single" w:sz="4" w:space="0" w:color="DCDCDC"/>
               <w:left w:val="nil"/>
               <w:right w:val="nil"/>
             </w:tcBorders>
             <w:tcMar>
-              <w:top w:w="105" w:type="dxa"/>
-              <w:bottom w:w="105" w:type="dxa"/>
-              <w:left w:w="115" w:type="dxa"/>
-              <w:right w:w="115" w:type="dxa"/>
+              <w:top w:w="115" w:type="dxa"/>
+              <w:bottom w:w="115" w:type="dxa"/>
+              <w:left w:w="126" w:type="dxa"/>
+              <w:right w:w="126" w:type="dxa"/>
             </w:tcMar>
           </w:tcPr>
           <w:p>
@@ -793,7 +800,7 @@
               <w:rPr>
                 <w:rFonts w:ascii="Calibri" w:hAnsi="Calibri"/>
                 <w:b w:val="0"/>
-                <w:color w:val="333333"/>
+                <w:color w:val="2B2B2B"/>
                 <w:sz w:val="20"/>
               </w:rPr>
               <w:t>{{ item.product }}</w:t>
@@ -805,15 +812,15 @@
             <w:tcW w:type="dxa" w:w="1008"/>
             <w:tcBorders>
               <w:top w:val="nil"/>
-              <w:bottom w:val="single" w:sz="4" w:space="0" w:color="D4D4D4"/>
+              <w:bottom w:val="single" w:sz="4" w:space="0" w:color="DCDCDC"/>
               <w:left w:val="nil"/>
               <w:right w:val="nil"/>
             </w:tcBorders>
             <w:tcMar>
-              <w:top w:w="105" w:type="dxa"/>
-              <w:bottom w:w="105" w:type="dxa"/>
-              <w:left w:w="115" w:type="dxa"/>
-              <w:right w:w="115" w:type="dxa"/>
+              <w:top w:w="115" w:type="dxa"/>
+              <w:bottom w:w="115" w:type="dxa"/>
+              <w:left w:w="126" w:type="dxa"/>
+              <w:right w:w="126" w:type="dxa"/>
             </w:tcMar>
           </w:tcPr>
           <w:p>
@@ -825,7 +832,7 @@
               <w:rPr>
                 <w:rFonts w:ascii="Calibri" w:hAnsi="Calibri"/>
                 <w:b w:val="0"/>
-                <w:color w:val="333333"/>
+                <w:color w:val="2B2B2B"/>
                 <w:sz w:val="20"/>
               </w:rPr>
               <w:t>{{ item.qty }}</w:t>
@@ -837,15 +844,15 @@
             <w:tcW w:type="dxa" w:w="1656"/>
             <w:tcBorders>
               <w:top w:val="nil"/>
-              <w:bottom w:val="single" w:sz="4" w:space="0" w:color="D4D4D4"/>
+              <w:bottom w:val="single" w:sz="4" w:space="0" w:color="DCDCDC"/>
               <w:left w:val="nil"/>
               <w:right w:val="nil"/>
             </w:tcBorders>
             <w:tcMar>
-              <w:top w:w="105" w:type="dxa"/>
-              <w:bottom w:w="105" w:type="dxa"/>
-              <w:left w:w="115" w:type="dxa"/>
-              <w:right w:w="115" w:type="dxa"/>
+              <w:top w:w="115" w:type="dxa"/>
+              <w:bottom w:w="115" w:type="dxa"/>
+              <w:left w:w="126" w:type="dxa"/>
+              <w:right w:w="126" w:type="dxa"/>
             </w:tcMar>
           </w:tcPr>
           <w:p>
@@ -857,7 +864,7 @@
               <w:rPr>
                 <w:rFonts w:ascii="Calibri" w:hAnsi="Calibri"/>
                 <w:b w:val="0"/>
-                <w:color w:val="333333"/>
+                <w:color w:val="2B2B2B"/>
                 <w:sz w:val="20"/>
               </w:rPr>
               <w:t>{{ item.unit_price }}</w:t>
@@ -869,15 +876,15 @@
             <w:tcW w:type="dxa" w:w="1656"/>
             <w:tcBorders>
               <w:top w:val="nil"/>
-              <w:bottom w:val="single" w:sz="4" w:space="0" w:color="D4D4D4"/>
+              <w:bottom w:val="single" w:sz="4" w:space="0" w:color="DCDCDC"/>
               <w:left w:val="nil"/>
               <w:right w:val="nil"/>
             </w:tcBorders>
             <w:tcMar>
-              <w:top w:w="105" w:type="dxa"/>
-              <w:bottom w:w="105" w:type="dxa"/>
-              <w:left w:w="115" w:type="dxa"/>
-              <w:right w:w="115" w:type="dxa"/>
+              <w:top w:w="115" w:type="dxa"/>
+              <w:bottom w:w="115" w:type="dxa"/>
+              <w:left w:w="126" w:type="dxa"/>
+              <w:right w:w="126" w:type="dxa"/>
             </w:tcMar>
           </w:tcPr>
           <w:p>
@@ -888,8 +895,8 @@
             <w:r>
               <w:rPr>
                 <w:rFonts w:ascii="Calibri" w:hAnsi="Calibri"/>
-                <w:b w:val="0"/>
-                <w:color w:val="333333"/>
+                <w:b/>
+                <w:color w:val="111111"/>
                 <w:sz w:val="20"/>
               </w:rPr>
               <w:t>{{ item.line_total }}</w:t>
@@ -975,33 +982,78 @@
     </w:tbl>
     <w:p>
       <w:pPr>
-        <w:spacing w:before="0" w:after="200"/>
+        <w:spacing w:before="0" w:after="40"/>
       </w:pPr>
     </w:p>
-    <w:p>
-      <w:pPr>
-        <w:spacing w:before="0" w:after="0"/>
+    <w:tbl>
+      <w:tblPr>
+        <w:tblW w:type="auto" w:w="0"/>
         <w:jc w:val="right"/>
-      </w:pPr>
-      <w:r>
-        <w:rPr>
-          <w:rFonts w:ascii="Calibri" w:hAnsi="Calibri"/>
-          <w:b/>
-          <w:color w:val="111111"/>
-          <w:sz w:val="28"/>
-        </w:rPr>
-        <w:t xml:space="preserve">Order Total: </w:t>
-      </w:r>
-      <w:r>
-        <w:rPr>
-          <w:rFonts w:ascii="Calibri" w:hAnsi="Calibri"/>
-          <w:b/>
-          <w:color w:val="111111"/>
-          <w:sz w:val="28"/>
-        </w:rPr>
-        <w:t>{{ order_total }}</w:t>
-      </w:r>
-    </w:p>
+        <w:tblLayout w:type="fixed"/>
+        <w:tblLook w:firstColumn="1" w:firstRow="1" w:lastColumn="0" w:lastRow="0" w:noHBand="0" w:noVBand="1" w:val="04A0"/>
+        <w:tblLayout w:type="fixed"/>
+        <w:tblCellSpacing w:w="0" w:type="dxa"/>
+      </w:tblPr>
+      <w:tblGrid>
+        <w:gridCol w:w="10080"/>
+      </w:tblGrid>
+      <w:tr>
+        <w:tc>
+          <w:tcPr>
+            <w:tcW w:type="dxa" w:w="4896"/>
+            <w:tcBorders>
+              <w:top w:val="single" w:sz="16" w:space="0" w:color="222222"/>
+              <w:bottom w:val="nil"/>
+              <w:left w:val="nil"/>
+              <w:right w:val="nil"/>
+            </w:tcBorders>
+            <w:tcMar>
+              <w:top w:w="110" w:type="dxa"/>
+              <w:bottom w:w="110" w:type="dxa"/>
+              <w:left w:w="121" w:type="dxa"/>
+              <w:right w:w="121" w:type="dxa"/>
+            </w:tcMar>
+          </w:tcPr>
+          <w:p>
+            <w:pPr>
+              <w:tabs>
+                <w:tab w:pos="4608" w:val="right"/>
+              </w:tabs>
+              <w:spacing w:before="0" w:after="0"/>
+            </w:pPr>
+            <w:r>
+              <w:rPr>
+                <w:rFonts w:ascii="Calibri" w:hAnsi="Calibri"/>
+                <w:b/>
+                <w:caps/>
+                <w:color w:val="737373"/>
+                <w:sz w:val="20"/>
+                <w:spacing w:val="20"/>
+              </w:rPr>
+              <w:t>Order Total</w:t>
+            </w:r>
+            <w:r>
+              <w:rPr>
+                <w:rFonts w:ascii="Calibri" w:hAnsi="Calibri"/>
+                <w:b w:val="0"/>
+                <w:color w:val="111111"/>
+                <w:sz w:val="20"/>
+              </w:rPr>
+              <w:tab/>
+            </w:r>
+            <w:r>
+              <w:rPr>
+                <w:rFonts w:ascii="Calibri" w:hAnsi="Calibri"/>
+                <w:b/>
+                <w:color w:val="111111"/>
+                <w:sz w:val="30"/>
+              </w:rPr>
+              <w:t>{{ order_total }}</w:t>
+            </w:r>
+          </w:p>
+        </w:tc>
+      </w:tr>
+    </w:tbl>
     <w:sectPr>
       <w:pgSz w:w="12240" w:h="15840"/>
       <w:pgMar w:top="1080" w:right="1080" w:bottom="1080" w:left="1080" w:header="720" w:footer="720" w:gutter="0"/>

</xml_diff>

<commit_message>
Rounded info panels; robust free-form input extraction
Design:
- Info cards are now VML rounded rectangles (v:roundrect) with content in the
  shape text box; Word table cells cannot have rounded corners
- Each row is one full-width panel containing a two-column table, so the two
  columns can never mismatch in height and long addresses are not clipped
- Zero out Normal style spacing, which was inflating content until it clipped

Extraction:
- Prompt now handles arbitrary layouts: any qty/price notation, bullets,
  tables, missing unit prices or line totals, other currencies, noise lines,
  and varied labels; includes an explicit completeness self-check
- Derive missing qty/unit price rather than zeroing the line
- Flag probable dropped items by comparing against a raw-text line count
</commit_message>
<xml_diff>
--- a/template.docx
+++ b/template.docx
@@ -167,352 +167,324 @@
         </w:rPr>
       </w:r>
     </w:p>
-    <w:tbl>
-      <w:tblPr>
-        <w:tblW w:type="auto" w:w="0"/>
-        <w:jc w:val="center"/>
-        <w:tblLayout w:type="fixed"/>
-        <w:tblLook w:firstColumn="1" w:firstRow="1" w:lastColumn="0" w:lastRow="0" w:noHBand="0" w:noVBand="1" w:val="04A0"/>
-        <w:tblLayout w:type="fixed"/>
-        <w:tblCellSpacing w:w="0" w:type="dxa"/>
-      </w:tblPr>
-      <w:tblGrid>
-        <w:gridCol w:w="3360"/>
-        <w:gridCol w:w="3360"/>
-        <w:gridCol w:w="3360"/>
-      </w:tblGrid>
-      <w:tr>
-        <w:tc>
-          <w:tcPr>
-            <w:tcW w:type="dxa" w:w="4824"/>
-            <w:tcBorders>
-              <w:top w:val="single" w:sz="8" w:space="0" w:color="DCDCDC"/>
-              <w:bottom w:val="single" w:sz="8" w:space="0" w:color="DCDCDC"/>
-              <w:left w:val="single" w:sz="8" w:space="0" w:color="DCDCDC"/>
-              <w:right w:val="single" w:sz="8" w:space="0" w:color="DCDCDC"/>
-            </w:tcBorders>
-            <w:shd w:val="clear" w:color="auto" w:fill="F5F5F5"/>
-            <w:tcMar>
-              <w:top w:w="150" w:type="dxa"/>
-              <w:bottom w:w="150" w:type="dxa"/>
-              <w:left w:w="165" w:type="dxa"/>
-              <w:right w:w="165" w:type="dxa"/>
-            </w:tcMar>
-          </w:tcPr>
-          <w:p>
-            <w:pPr>
-              <w:spacing w:before="0" w:after="80"/>
-            </w:pPr>
-            <w:r>
-              <w:rPr>
-                <w:rFonts w:ascii="Calibri" w:hAnsi="Calibri"/>
-                <w:b/>
-                <w:caps/>
-                <w:color w:val="737373"/>
-                <w:sz w:val="15"/>
-                <w:spacing w:val="18"/>
-              </w:rPr>
-              <w:t>Reseller</w:t>
-            </w:r>
-          </w:p>
-          <w:p>
-            <w:pPr>
-              <w:spacing w:before="0" w:after="0"/>
-            </w:pPr>
-            <w:r>
-              <w:rPr>
-                <w:rFonts w:ascii="Calibri" w:hAnsi="Calibri"/>
-                <w:b/>
-                <w:color w:val="111111"/>
-                <w:sz w:val="24"/>
-              </w:rPr>
-              <w:t>{{ reseller_info }}</w:t>
-            </w:r>
-          </w:p>
-          <w:p>
-            <w:pPr>
-              <w:spacing w:before="40" w:after="0"/>
-            </w:pPr>
-          </w:p>
-          <w:p>
-            <w:pPr>
-              <w:spacing w:before="40" w:after="0"/>
-            </w:pPr>
-          </w:p>
-        </w:tc>
-        <w:tc>
-          <w:tcPr>
-            <w:tcW w:type="dxa" w:w="432"/>
-            <w:tcBorders>
-              <w:top w:val="nil"/>
-              <w:bottom w:val="nil"/>
-              <w:left w:val="nil"/>
-              <w:right w:val="nil"/>
-            </w:tcBorders>
-          </w:tcPr>
-          <w:p/>
-        </w:tc>
-        <w:tc>
-          <w:tcPr>
-            <w:tcW w:type="dxa" w:w="4824"/>
-            <w:tcBorders>
-              <w:top w:val="single" w:sz="8" w:space="0" w:color="DCDCDC"/>
-              <w:bottom w:val="single" w:sz="8" w:space="0" w:color="DCDCDC"/>
-              <w:left w:val="single" w:sz="8" w:space="0" w:color="DCDCDC"/>
-              <w:right w:val="single" w:sz="8" w:space="0" w:color="DCDCDC"/>
-            </w:tcBorders>
-            <w:shd w:val="clear" w:color="auto" w:fill="F5F5F5"/>
-            <w:tcMar>
-              <w:top w:w="150" w:type="dxa"/>
-              <w:bottom w:w="150" w:type="dxa"/>
-              <w:left w:w="165" w:type="dxa"/>
-              <w:right w:w="165" w:type="dxa"/>
-            </w:tcMar>
-          </w:tcPr>
-          <w:p>
-            <w:pPr>
-              <w:spacing w:before="0" w:after="80"/>
-            </w:pPr>
-            <w:r>
-              <w:rPr>
-                <w:rFonts w:ascii="Calibri" w:hAnsi="Calibri"/>
-                <w:b/>
-                <w:caps/>
-                <w:color w:val="737373"/>
-                <w:sz w:val="15"/>
-                <w:spacing w:val="18"/>
-              </w:rPr>
-              <w:t>Customer / Receiver</w:t>
-            </w:r>
-          </w:p>
-          <w:p>
-            <w:pPr>
-              <w:spacing w:before="0" w:after="0"/>
-            </w:pPr>
-            <w:r>
-              <w:rPr>
-                <w:rFonts w:ascii="Calibri" w:hAnsi="Calibri"/>
-                <w:b/>
-                <w:color w:val="111111"/>
-                <w:sz w:val="24"/>
-              </w:rPr>
-              <w:t>{{ customer_name }}</w:t>
-            </w:r>
-          </w:p>
-          <w:p>
-            <w:pPr>
-              <w:spacing w:before="60" w:after="0"/>
-            </w:pPr>
-            <w:r>
-              <w:rPr>
-                <w:rFonts w:ascii="Calibri" w:hAnsi="Calibri"/>
-                <w:b w:val="0"/>
-                <w:color w:val="737373"/>
-                <w:sz w:val="19"/>
-              </w:rPr>
-              <w:t>{{ customer_address }}</w:t>
-            </w:r>
-          </w:p>
-        </w:tc>
-      </w:tr>
-    </w:tbl>
     <w:p>
       <w:pPr>
-        <w:spacing w:before="0" w:after="120"/>
+        <w:spacing w:before="0" w:after="0" w:line="240" w:lineRule="auto"/>
+      </w:pPr>
+      <w:r>
+        <w:pict>
+          <v:roundrect style="width:504pt;height:64pt;v-text-anchor:top;mso-fit-shape-to-text:t" arcsize="6554f" fillcolor="#F5F5F5" strokecolor="#DCDCDC" strokeweight="1pt">
+            <v:textbox inset="12pt,10pt,12pt,10pt" style="mso-fit-shape-to-text:t">
+              <w:txbxContent>
+                <w:tbl>
+                  <w:tblPr>
+                    <w:tblW w:type="auto" w:w="0"/>
+                    <w:tblLayout w:type="fixed"/>
+                    <w:tblLook w:firstColumn="1" w:firstRow="1" w:lastColumn="0" w:lastRow="0" w:noHBand="0" w:noVBand="1" w:val="04A0"/>
+                    <w:tblLayout w:type="fixed"/>
+                    <w:tblCellSpacing w:w="0" w:type="dxa"/>
+                  </w:tblPr>
+                  <w:tblGrid>
+                    <w:gridCol w:w="2880"/>
+                    <w:gridCol w:w="2880"/>
+                    <w:gridCol w:w="2880"/>
+                  </w:tblGrid>
+                  <w:tr>
+                    <w:tc>
+                      <w:tcPr>
+                        <w:tcW w:type="dxa" w:w="4536"/>
+                        <w:tcBorders>
+                          <w:top w:val="nil"/>
+                          <w:bottom w:val="nil"/>
+                          <w:left w:val="nil"/>
+                          <w:right w:val="nil"/>
+                        </w:tcBorders>
+                        <w:tcMar>
+                          <w:top w:w="0" w:type="dxa"/>
+                          <w:bottom w:w="0" w:type="dxa"/>
+                          <w:left w:w="0" w:type="dxa"/>
+                          <w:right w:w="0" w:type="dxa"/>
+                        </w:tcMar>
+                      </w:tcPr>
+                      <w:p>
+                        <w:pPr>
+                          <w:spacing w:before="0" w:after="80"/>
+                        </w:pPr>
+                        <w:r>
+                          <w:rPr>
+                            <w:rFonts w:ascii="Calibri" w:hAnsi="Calibri"/>
+                            <w:b/>
+                            <w:caps/>
+                            <w:color w:val="737373"/>
+                            <w:sz w:val="15"/>
+                            <w:spacing w:val="18"/>
+                          </w:rPr>
+                          <w:t>Reseller</w:t>
+                        </w:r>
+                      </w:p>
+                      <w:p>
+                        <w:pPr>
+                          <w:spacing w:before="0" w:after="0"/>
+                        </w:pPr>
+                        <w:r>
+                          <w:rPr>
+                            <w:rFonts w:ascii="Calibri" w:hAnsi="Calibri"/>
+                            <w:b/>
+                            <w:color w:val="111111"/>
+                            <w:sz w:val="24"/>
+                          </w:rPr>
+                          <w:t>{{ reseller_info }}</w:t>
+                        </w:r>
+                      </w:p>
+                    </w:tc>
+                    <w:tc>
+                      <w:tcPr>
+                        <w:tcW w:type="dxa" w:w="504"/>
+                        <w:tcBorders>
+                          <w:top w:val="nil"/>
+                          <w:bottom w:val="nil"/>
+                          <w:left w:val="nil"/>
+                          <w:right w:val="nil"/>
+                        </w:tcBorders>
+                        <w:tcMar>
+                          <w:top w:w="0" w:type="dxa"/>
+                          <w:bottom w:w="0" w:type="dxa"/>
+                          <w:left w:w="0" w:type="dxa"/>
+                          <w:right w:w="0" w:type="dxa"/>
+                        </w:tcMar>
+                      </w:tcPr>
+                      <w:p/>
+                    </w:tc>
+                    <w:tc>
+                      <w:tcPr>
+                        <w:tcW w:type="dxa" w:w="4536"/>
+                        <w:tcBorders>
+                          <w:top w:val="nil"/>
+                          <w:bottom w:val="nil"/>
+                          <w:left w:val="nil"/>
+                          <w:right w:val="nil"/>
+                        </w:tcBorders>
+                        <w:tcMar>
+                          <w:top w:w="0" w:type="dxa"/>
+                          <w:bottom w:w="0" w:type="dxa"/>
+                          <w:left w:w="0" w:type="dxa"/>
+                          <w:right w:w="0" w:type="dxa"/>
+                        </w:tcMar>
+                      </w:tcPr>
+                      <w:p>
+                        <w:pPr>
+                          <w:spacing w:before="0" w:after="80"/>
+                        </w:pPr>
+                        <w:r>
+                          <w:rPr>
+                            <w:rFonts w:ascii="Calibri" w:hAnsi="Calibri"/>
+                            <w:b/>
+                            <w:caps/>
+                            <w:color w:val="737373"/>
+                            <w:sz w:val="15"/>
+                            <w:spacing w:val="18"/>
+                          </w:rPr>
+                          <w:t>Customer / Receiver</w:t>
+                        </w:r>
+                      </w:p>
+                      <w:p>
+                        <w:pPr>
+                          <w:spacing w:before="0" w:after="0"/>
+                        </w:pPr>
+                        <w:r>
+                          <w:rPr>
+                            <w:rFonts w:ascii="Calibri" w:hAnsi="Calibri"/>
+                            <w:b/>
+                            <w:color w:val="111111"/>
+                            <w:sz w:val="24"/>
+                          </w:rPr>
+                          <w:t>{{ customer_name }}</w:t>
+                        </w:r>
+                      </w:p>
+                      <w:p>
+                        <w:pPr>
+                          <w:spacing w:before="60" w:after="0"/>
+                        </w:pPr>
+                        <w:r>
+                          <w:rPr>
+                            <w:rFonts w:ascii="Calibri" w:hAnsi="Calibri"/>
+                            <w:b w:val="0"/>
+                            <w:color w:val="737373"/>
+                            <w:sz w:val="19"/>
+                          </w:rPr>
+                          <w:t>{{ customer_address }}</w:t>
+                        </w:r>
+                      </w:p>
+                    </w:tc>
+                  </w:tr>
+                </w:tbl>
+                <w:p>
+                  <w:pPr>
+                    <w:spacing w:after="0" w:line="120" w:lineRule="exact"/>
+                  </w:pPr>
+                </w:p>
+              </w:txbxContent>
+            </v:textbox>
+          </v:roundrect>
+        </w:pict>
+      </w:r>
+    </w:p>
+    <w:p>
+      <w:pPr>
+        <w:spacing w:before="0" w:after="100"/>
       </w:pPr>
     </w:p>
-    <w:tbl>
-      <w:tblPr>
-        <w:tblW w:type="auto" w:w="0"/>
-        <w:jc w:val="center"/>
-        <w:tblLayout w:type="fixed"/>
-        <w:tblLook w:firstColumn="1" w:firstRow="1" w:lastColumn="0" w:lastRow="0" w:noHBand="0" w:noVBand="1" w:val="04A0"/>
-        <w:tblLayout w:type="fixed"/>
-        <w:tblCellSpacing w:w="0" w:type="dxa"/>
-      </w:tblPr>
-      <w:tblGrid>
-        <w:gridCol w:w="3360"/>
-        <w:gridCol w:w="3360"/>
-        <w:gridCol w:w="3360"/>
-      </w:tblGrid>
-      <w:tr>
-        <w:tc>
-          <w:tcPr>
-            <w:tcW w:type="dxa" w:w="4824"/>
-            <w:tcBorders>
-              <w:top w:val="single" w:sz="8" w:space="0" w:color="DCDCDC"/>
-              <w:bottom w:val="single" w:sz="8" w:space="0" w:color="DCDCDC"/>
-              <w:left w:val="single" w:sz="8" w:space="0" w:color="DCDCDC"/>
-              <w:right w:val="single" w:sz="8" w:space="0" w:color="DCDCDC"/>
-            </w:tcBorders>
-            <w:shd w:val="clear" w:color="auto" w:fill="F5F5F5"/>
-            <w:tcMar>
-              <w:top w:w="150" w:type="dxa"/>
-              <w:bottom w:w="150" w:type="dxa"/>
-              <w:left w:w="165" w:type="dxa"/>
-              <w:right w:w="165" w:type="dxa"/>
-            </w:tcMar>
-          </w:tcPr>
-          <w:p>
-            <w:pPr>
-              <w:spacing w:before="0" w:after="80"/>
-            </w:pPr>
-            <w:r>
-              <w:rPr>
-                <w:rFonts w:ascii="Calibri" w:hAnsi="Calibri"/>
-                <w:b/>
-                <w:caps/>
-                <w:color w:val="737373"/>
-                <w:sz w:val="15"/>
-                <w:spacing w:val="18"/>
-              </w:rPr>
-              <w:t>Payment Status</w:t>
-            </w:r>
-          </w:p>
-          <w:tbl>
-            <w:tblPr>
-              <w:tblW w:type="auto" w:w="0"/>
-              <w:tblLayout w:type="fixed"/>
-              <w:tblLook w:firstColumn="1" w:firstRow="1" w:lastColumn="0" w:lastRow="0" w:noHBand="0" w:noVBand="1" w:val="04A0"/>
-            </w:tblPr>
-            <w:tblGrid>
-              <w:gridCol w:w="4824"/>
-            </w:tblGrid>
-            <w:tr>
-              <w:tc>
-                <w:tcPr>
-                  <w:tcW w:type="dxa" w:w="2448"/>
-                  <w:tcBorders>
-                    <w:top w:val="single" w:sz="8" w:space="0" w:color="B0B0B0"/>
-                    <w:bottom w:val="single" w:sz="8" w:space="0" w:color="B0B0B0"/>
-                    <w:left w:val="single" w:sz="8" w:space="0" w:color="B0B0B0"/>
-                    <w:right w:val="single" w:sz="8" w:space="0" w:color="B0B0B0"/>
-                  </w:tcBorders>
-                  <w:shd w:val="clear" w:color="auto" w:fill="FFFFFF"/>
-                  <w:tcMar>
-                    <w:top w:w="85" w:type="dxa"/>
-                    <w:bottom w:w="85" w:type="dxa"/>
-                    <w:left w:w="93" w:type="dxa"/>
-                    <w:right w:w="93" w:type="dxa"/>
-                  </w:tcMar>
-                </w:tcPr>
+    <w:p>
+      <w:pPr>
+        <w:spacing w:before="0" w:after="0" w:line="240" w:lineRule="auto"/>
+      </w:pPr>
+      <w:r>
+        <w:pict>
+          <v:roundrect style="width:504pt;height:40pt;v-text-anchor:top;mso-fit-shape-to-text:t" arcsize="6554f" fillcolor="#F5F5F5" strokecolor="#DCDCDC" strokeweight="1pt">
+            <v:textbox inset="12pt,10pt,12pt,10pt" style="mso-fit-shape-to-text:t">
+              <w:txbxContent>
+                <w:tbl>
+                  <w:tblPr>
+                    <w:tblW w:type="auto" w:w="0"/>
+                    <w:tblLayout w:type="fixed"/>
+                    <w:tblLook w:firstColumn="1" w:firstRow="1" w:lastColumn="0" w:lastRow="0" w:noHBand="0" w:noVBand="1" w:val="04A0"/>
+                    <w:tblLayout w:type="fixed"/>
+                    <w:tblCellSpacing w:w="0" w:type="dxa"/>
+                  </w:tblPr>
+                  <w:tblGrid>
+                    <w:gridCol w:w="2880"/>
+                    <w:gridCol w:w="2880"/>
+                    <w:gridCol w:w="2880"/>
+                  </w:tblGrid>
+                  <w:tr>
+                    <w:tc>
+                      <w:tcPr>
+                        <w:tcW w:type="dxa" w:w="4536"/>
+                        <w:tcBorders>
+                          <w:top w:val="nil"/>
+                          <w:bottom w:val="nil"/>
+                          <w:left w:val="nil"/>
+                          <w:right w:val="nil"/>
+                        </w:tcBorders>
+                        <w:tcMar>
+                          <w:top w:w="0" w:type="dxa"/>
+                          <w:bottom w:w="0" w:type="dxa"/>
+                          <w:left w:w="0" w:type="dxa"/>
+                          <w:right w:w="0" w:type="dxa"/>
+                        </w:tcMar>
+                      </w:tcPr>
+                      <w:p>
+                        <w:pPr>
+                          <w:spacing w:before="0" w:after="80"/>
+                        </w:pPr>
+                        <w:r>
+                          <w:rPr>
+                            <w:rFonts w:ascii="Calibri" w:hAnsi="Calibri"/>
+                            <w:b/>
+                            <w:caps/>
+                            <w:color w:val="737373"/>
+                            <w:sz w:val="15"/>
+                            <w:spacing w:val="18"/>
+                          </w:rPr>
+                          <w:t>Payment Status</w:t>
+                        </w:r>
+                      </w:p>
+                      <w:p>
+                        <w:pPr>
+                          <w:spacing w:before="0" w:after="0"/>
+                        </w:pPr>
+                        <w:r>
+                          <w:rPr>
+                            <w:rFonts w:ascii="Calibri" w:hAnsi="Calibri"/>
+                            <w:b/>
+                            <w:color w:val="111111"/>
+                            <w:sz w:val="24"/>
+                          </w:rPr>
+                          <w:t>{{ payment_status }}</w:t>
+                        </w:r>
+                      </w:p>
+                    </w:tc>
+                    <w:tc>
+                      <w:tcPr>
+                        <w:tcW w:type="dxa" w:w="504"/>
+                        <w:tcBorders>
+                          <w:top w:val="nil"/>
+                          <w:bottom w:val="nil"/>
+                          <w:left w:val="nil"/>
+                          <w:right w:val="nil"/>
+                        </w:tcBorders>
+                        <w:tcMar>
+                          <w:top w:w="0" w:type="dxa"/>
+                          <w:bottom w:w="0" w:type="dxa"/>
+                          <w:left w:w="0" w:type="dxa"/>
+                          <w:right w:w="0" w:type="dxa"/>
+                        </w:tcMar>
+                      </w:tcPr>
+                      <w:p/>
+                    </w:tc>
+                    <w:tc>
+                      <w:tcPr>
+                        <w:tcW w:type="dxa" w:w="4536"/>
+                        <w:tcBorders>
+                          <w:top w:val="nil"/>
+                          <w:bottom w:val="nil"/>
+                          <w:left w:val="nil"/>
+                          <w:right w:val="nil"/>
+                        </w:tcBorders>
+                        <w:tcMar>
+                          <w:top w:w="0" w:type="dxa"/>
+                          <w:bottom w:w="0" w:type="dxa"/>
+                          <w:left w:w="0" w:type="dxa"/>
+                          <w:right w:w="0" w:type="dxa"/>
+                        </w:tcMar>
+                      </w:tcPr>
+                      <w:p>
+                        <w:pPr>
+                          <w:spacing w:before="0" w:after="80"/>
+                        </w:pPr>
+                        <w:r>
+                          <w:rPr>
+                            <w:rFonts w:ascii="Calibri" w:hAnsi="Calibri"/>
+                            <w:b/>
+                            <w:caps/>
+                            <w:color w:val="737373"/>
+                            <w:sz w:val="15"/>
+                            <w:spacing w:val="18"/>
+                          </w:rPr>
+                          <w:t>Shipping Status</w:t>
+                        </w:r>
+                      </w:p>
+                      <w:p>
+                        <w:pPr>
+                          <w:spacing w:before="0" w:after="0"/>
+                        </w:pPr>
+                        <w:r>
+                          <w:rPr>
+                            <w:rFonts w:ascii="Calibri" w:hAnsi="Calibri"/>
+                            <w:b/>
+                            <w:color w:val="111111"/>
+                            <w:sz w:val="24"/>
+                          </w:rPr>
+                          <w:t>{{ shipping_status }}</w:t>
+                        </w:r>
+                      </w:p>
+                    </w:tc>
+                  </w:tr>
+                </w:tbl>
                 <w:p>
                   <w:pPr>
-                    <w:spacing w:before="0" w:after="0"/>
-                    <w:jc w:val="center"/>
+                    <w:spacing w:after="0" w:line="120" w:lineRule="exact"/>
                   </w:pPr>
-                  <w:r>
-                    <w:rPr>
-                      <w:rFonts w:ascii="Calibri" w:hAnsi="Calibri"/>
-                      <w:b/>
-                      <w:color w:val="111111"/>
-                      <w:sz w:val="20"/>
-                    </w:rPr>
-                    <w:t>{{ payment_status }}</w:t>
-                  </w:r>
                 </w:p>
-              </w:tc>
-            </w:tr>
-          </w:tbl>
-          <w:p/>
-        </w:tc>
-        <w:tc>
-          <w:tcPr>
-            <w:tcW w:type="dxa" w:w="432"/>
-            <w:tcBorders>
-              <w:top w:val="nil"/>
-              <w:bottom w:val="nil"/>
-              <w:left w:val="nil"/>
-              <w:right w:val="nil"/>
-            </w:tcBorders>
-          </w:tcPr>
-          <w:p/>
-        </w:tc>
-        <w:tc>
-          <w:tcPr>
-            <w:tcW w:type="dxa" w:w="4824"/>
-            <w:tcBorders>
-              <w:top w:val="single" w:sz="8" w:space="0" w:color="DCDCDC"/>
-              <w:bottom w:val="single" w:sz="8" w:space="0" w:color="DCDCDC"/>
-              <w:left w:val="single" w:sz="8" w:space="0" w:color="DCDCDC"/>
-              <w:right w:val="single" w:sz="8" w:space="0" w:color="DCDCDC"/>
-            </w:tcBorders>
-            <w:shd w:val="clear" w:color="auto" w:fill="F5F5F5"/>
-            <w:tcMar>
-              <w:top w:w="150" w:type="dxa"/>
-              <w:bottom w:w="150" w:type="dxa"/>
-              <w:left w:w="165" w:type="dxa"/>
-              <w:right w:w="165" w:type="dxa"/>
-            </w:tcMar>
-          </w:tcPr>
-          <w:p>
-            <w:pPr>
-              <w:spacing w:before="0" w:after="80"/>
-            </w:pPr>
-            <w:r>
-              <w:rPr>
-                <w:rFonts w:ascii="Calibri" w:hAnsi="Calibri"/>
-                <w:b/>
-                <w:caps/>
-                <w:color w:val="737373"/>
-                <w:sz w:val="15"/>
-                <w:spacing w:val="18"/>
-              </w:rPr>
-              <w:t>Shipping Status</w:t>
-            </w:r>
-          </w:p>
-          <w:tbl>
-            <w:tblPr>
-              <w:tblW w:type="auto" w:w="0"/>
-              <w:tblLayout w:type="fixed"/>
-              <w:tblLook w:firstColumn="1" w:firstRow="1" w:lastColumn="0" w:lastRow="0" w:noHBand="0" w:noVBand="1" w:val="04A0"/>
-            </w:tblPr>
-            <w:tblGrid>
-              <w:gridCol w:w="4824"/>
-            </w:tblGrid>
-            <w:tr>
-              <w:tc>
-                <w:tcPr>
-                  <w:tcW w:type="dxa" w:w="2448"/>
-                  <w:tcBorders>
-                    <w:top w:val="single" w:sz="8" w:space="0" w:color="B0B0B0"/>
-                    <w:bottom w:val="single" w:sz="8" w:space="0" w:color="B0B0B0"/>
-                    <w:left w:val="single" w:sz="8" w:space="0" w:color="B0B0B0"/>
-                    <w:right w:val="single" w:sz="8" w:space="0" w:color="B0B0B0"/>
-                  </w:tcBorders>
-                  <w:shd w:val="clear" w:color="auto" w:fill="FFFFFF"/>
-                  <w:tcMar>
-                    <w:top w:w="85" w:type="dxa"/>
-                    <w:bottom w:w="85" w:type="dxa"/>
-                    <w:left w:w="93" w:type="dxa"/>
-                    <w:right w:w="93" w:type="dxa"/>
-                  </w:tcMar>
-                </w:tcPr>
-                <w:p>
-                  <w:pPr>
-                    <w:spacing w:before="0" w:after="0"/>
-                    <w:jc w:val="center"/>
-                  </w:pPr>
-                  <w:r>
-                    <w:rPr>
-                      <w:rFonts w:ascii="Calibri" w:hAnsi="Calibri"/>
-                      <w:b/>
-                      <w:color w:val="111111"/>
-                      <w:sz w:val="20"/>
-                    </w:rPr>
-                    <w:t>{{ shipping_status }}</w:t>
-                  </w:r>
-                </w:p>
-              </w:tc>
-            </w:tr>
-          </w:tbl>
-          <w:p/>
-        </w:tc>
-      </w:tr>
-    </w:tbl>
+              </w:txbxContent>
+            </v:textbox>
+          </v:roundrect>
+        </w:pict>
+      </w:r>
+    </w:p>
     <w:p>
       <w:pPr>
-        <w:spacing w:before="0" w:after="200"/>
+        <w:spacing w:before="0" w:after="180"/>
       </w:pPr>
     </w:p>
     <w:p>
@@ -1427,6 +1399,9 @@
     <w:name w:val="Normal"/>
     <w:qFormat/>
     <w:rsid w:val="00FC693F"/>
+    <w:pPr>
+      <w:spacing w:before="0" w:after="0" w:line="240" w:lineRule="auto"/>
+    </w:pPr>
     <w:rPr>
       <w:rFonts w:ascii="Calibri" w:hAnsi="Calibri"/>
       <w:sz w:val="20"/>

</xml_diff>

<commit_message>
Use the ML Trading International logo in the masthead
- Embed logo.jpeg in place of the company name text
- Trim the logo's baked-in white margin at build time so the mark sits flush
  to the page margin instead of looking indented
- Fall back to the {{ company_name }} text if the logo file is absent
</commit_message>
<xml_diff>
--- a/template.docx
+++ b/template.docx
@@ -32,13 +32,38 @@
               <w:spacing w:before="0" w:after="0"/>
             </w:pPr>
             <w:r>
-              <w:rPr>
-                <w:rFonts w:ascii="Calibri" w:hAnsi="Calibri"/>
-                <w:b/>
-                <w:color w:val="111111"/>
-                <w:sz w:val="42"/>
-              </w:rPr>
-              <w:t>{{ company_name }}</w:t>
+              <w:drawing>
+                <wp:inline xmlns:a="http://schemas.openxmlformats.org/drawingml/2006/main" xmlns:pic="http://schemas.openxmlformats.org/drawingml/2006/picture">
+                  <wp:extent cx="2468880" cy="420783"/>
+                  <wp:docPr id="1" name="Picture 1"/>
+                  <wp:cNvGraphicFramePr>
+                    <a:graphicFrameLocks noChangeAspect="1"/>
+                  </wp:cNvGraphicFramePr>
+                  <a:graphic>
+                    <a:graphicData uri="http://schemas.openxmlformats.org/drawingml/2006/picture">
+                      <pic:pic>
+                        <pic:nvPicPr>
+                          <pic:cNvPr id="0" name="image.png"/>
+                          <pic:cNvPicPr/>
+                        </pic:nvPicPr>
+                        <pic:blipFill>
+                          <a:blip r:embed="rId9"/>
+                          <a:stretch>
+                            <a:fillRect/>
+                          </a:stretch>
+                        </pic:blipFill>
+                        <pic:spPr>
+                          <a:xfrm>
+                            <a:off x="0" y="0"/>
+                            <a:ext cx="2468880" cy="420783"/>
+                          </a:xfrm>
+                          <a:prstGeom prst="rect"/>
+                        </pic:spPr>
+                      </pic:pic>
+                    </a:graphicData>
+                  </a:graphic>
+                </wp:inline>
+              </w:drawing>
             </w:r>
           </w:p>
         </w:tc>

</xml_diff>